<commit_message>
Revised the final paper rubric and coding leader set up
</commit_message>
<xml_diff>
--- a/rubric_and_guidelines/final_paper_rubric.docx
+++ b/rubric_and_guidelines/final_paper_rubric.docx
@@ -1,6 +1,6 @@
 
 <file path=word/document.xml><?xml version="1.0" encoding="utf-8"?>
-<w:document xmlns:wpc="http://schemas.microsoft.com/office/word/2010/wordprocessingCanvas" xmlns:mc="http://schemas.openxmlformats.org/markup-compatibility/2006" xmlns:o="urn:schemas-microsoft-com:office:office" xmlns:r="http://schemas.openxmlformats.org/officeDocument/2006/relationships" xmlns:m="http://schemas.openxmlformats.org/officeDocument/2006/math" xmlns:v="urn:schemas-microsoft-com:vml" xmlns:wp14="http://schemas.microsoft.com/office/word/2010/wordprocessingDrawing" xmlns:wp="http://schemas.openxmlformats.org/drawingml/2006/wordprocessingDrawing" xmlns:w10="urn:schemas-microsoft-com:office:word" xmlns:w="http://schemas.openxmlformats.org/wordprocessingml/2006/main" xmlns:w14="http://schemas.microsoft.com/office/word/2010/wordml" xmlns:w15="http://schemas.microsoft.com/office/word/2012/wordml" xmlns:wpg="http://schemas.microsoft.com/office/word/2010/wordprocessingGroup" xmlns:wpi="http://schemas.microsoft.com/office/word/2010/wordprocessingInk" xmlns:wne="http://schemas.microsoft.com/office/word/2006/wordml" xmlns:wps="http://schemas.microsoft.com/office/word/2010/wordprocessingShape" xmlns:cx="http://schemas.microsoft.com/office/drawing/2014/chartex" xmlns:cx1="http://schemas.microsoft.com/office/drawing/2015/9/8/chartex" xmlns:cx2="http://schemas.microsoft.com/office/drawing/2015/10/21/chartex" xmlns:cx3="http://schemas.microsoft.com/office/drawing/2016/5/9/chartex" xmlns:cx4="http://schemas.microsoft.com/office/drawing/2016/5/10/chartex" xmlns:cx5="http://schemas.microsoft.com/office/drawing/2016/5/11/chartex" xmlns:cx6="http://schemas.microsoft.com/office/drawing/2016/5/12/chartex" xmlns:cx7="http://schemas.microsoft.com/office/drawing/2016/5/13/chartex" xmlns:cx8="http://schemas.microsoft.com/office/drawing/2016/5/14/chartex" xmlns:aink="http://schemas.microsoft.com/office/drawing/2016/ink" xmlns:am3d="http://schemas.microsoft.com/office/drawing/2017/model3d" xmlns:w16cex="http://schemas.microsoft.com/office/word/2018/wordml/cex" xmlns:w16cid="http://schemas.microsoft.com/office/word/2016/wordml/cid" xmlns:w16="http://schemas.microsoft.com/office/word/2018/wordml" xmlns:w16sdtdh="http://schemas.microsoft.com/office/word/2020/wordml/sdtdatahash" xmlns:w16se="http://schemas.microsoft.com/office/word/2015/wordml/symex" mc:Ignorable="w14 w15 wp14">
+<w:document xmlns:wpc="http://schemas.microsoft.com/office/word/2010/wordprocessingCanvas" xmlns:cx="http://schemas.microsoft.com/office/drawing/2014/chartex" xmlns:cx1="http://schemas.microsoft.com/office/drawing/2015/9/8/chartex" xmlns:cx2="http://schemas.microsoft.com/office/drawing/2015/10/21/chartex" xmlns:cx3="http://schemas.microsoft.com/office/drawing/2016/5/9/chartex" xmlns:cx4="http://schemas.microsoft.com/office/drawing/2016/5/10/chartex" xmlns:cx5="http://schemas.microsoft.com/office/drawing/2016/5/11/chartex" xmlns:cx6="http://schemas.microsoft.com/office/drawing/2016/5/12/chartex" xmlns:cx7="http://schemas.microsoft.com/office/drawing/2016/5/13/chartex" xmlns:cx8="http://schemas.microsoft.com/office/drawing/2016/5/14/chartex" xmlns:mc="http://schemas.openxmlformats.org/markup-compatibility/2006" xmlns:aink="http://schemas.microsoft.com/office/drawing/2016/ink" xmlns:am3d="http://schemas.microsoft.com/office/drawing/2017/model3d" xmlns:o="urn:schemas-microsoft-com:office:office" xmlns:oel="http://schemas.microsoft.com/office/2019/extlst" xmlns:r="http://schemas.openxmlformats.org/officeDocument/2006/relationships" xmlns:m="http://schemas.openxmlformats.org/officeDocument/2006/math" xmlns:v="urn:schemas-microsoft-com:vml" xmlns:wp14="http://schemas.microsoft.com/office/word/2010/wordprocessingDrawing" xmlns:wp="http://schemas.openxmlformats.org/drawingml/2006/wordprocessingDrawing" xmlns:w10="urn:schemas-microsoft-com:office:word" xmlns:w="http://schemas.openxmlformats.org/wordprocessingml/2006/main" xmlns:w14="http://schemas.microsoft.com/office/word/2010/wordml" xmlns:w15="http://schemas.microsoft.com/office/word/2012/wordml" xmlns:w16cex="http://schemas.microsoft.com/office/word/2018/wordml/cex" xmlns:w16cid="http://schemas.microsoft.com/office/word/2016/wordml/cid" xmlns:w16="http://schemas.microsoft.com/office/word/2018/wordml" xmlns:w16du="http://schemas.microsoft.com/office/word/2023/wordml/word16du" xmlns:w16sdtdh="http://schemas.microsoft.com/office/word/2020/wordml/sdtdatahash" xmlns:w16sdtfl="http://schemas.microsoft.com/office/word/2024/wordml/sdtformatlock" xmlns:w16se="http://schemas.microsoft.com/office/word/2015/wordml/symex" xmlns:wpg="http://schemas.microsoft.com/office/word/2010/wordprocessingGroup" xmlns:wpi="http://schemas.microsoft.com/office/word/2010/wordprocessingInk" xmlns:wne="http://schemas.microsoft.com/office/word/2006/wordml" xmlns:wps="http://schemas.microsoft.com/office/word/2010/wordprocessingShape" mc:Ignorable="w14 w15 w16se w16cid w16 w16cex w16sdtdh w16sdtfl w16du wp14">
   <w:body>
     <w:p>
       <w:pPr>
@@ -9,14 +9,13 @@
       </w:pPr>
       <w:r>
         <w:rPr>
-          <w:rFonts w:ascii="Arial" w:cs="Arial" w:eastAsia="Arial" w:hAnsi="Arial"/>
           <w:b/>
           <w:bCs/>
           <w:color w:val="2E2E2E"/>
           <w:sz w:val="36"/>
           <w:szCs w:val="36"/>
         </w:rPr>
-        <w:t xml:space="preserve">SODA 501: Final Paper Guidelines &amp; Rubric</w:t>
+        <w:t>SODA 501: Final Paper Guidelines &amp; Rubric</w:t>
       </w:r>
     </w:p>
     <w:p>
@@ -26,12 +25,11 @@
       </w:pPr>
       <w:r>
         <w:rPr>
-          <w:rFonts w:ascii="Arial" w:cs="Arial" w:eastAsia="Arial" w:hAnsi="Arial"/>
           <w:color w:val="666666"/>
           <w:sz w:val="20"/>
           <w:szCs w:val="20"/>
         </w:rPr>
-        <w:t xml:space="preserve">Big Social Data  •  College of the Liberal Arts  •  Penn State</w:t>
+        <w:t>Big Social Data  •  College of the Liberal Arts  •  Penn State</w:t>
       </w:r>
     </w:p>
     <w:p>
@@ -39,7 +37,7 @@
         <w:pStyle w:val="Heading1"/>
       </w:pPr>
       <w:r>
-        <w:t xml:space="preserve">Expectations</w:t>
+        <w:t>Expectations</w:t>
       </w:r>
     </w:p>
     <w:p>
@@ -47,12 +45,7 @@
         <w:spacing w:after="200"/>
       </w:pPr>
       <w:r>
-        <w:rPr>
-          <w:rFonts w:ascii="Arial" w:cs="Arial" w:eastAsia="Arial" w:hAnsi="Arial"/>
-          <w:sz w:val="22"/>
-          <w:szCs w:val="22"/>
-        </w:rPr>
-        <w:t xml:space="preserve">The final paper is a collaborative piece of original research. My expectation is that the finished product is publishable with revisions at a peer-reviewed journal or conference. This means the paper should present a clear research question, engage with relevant literature, describe data and methods with enough detail for replication, and interpret results carefully. It should read as a complete manuscript, not a course assignment.</w:t>
+        <w:t>The final paper is a collaborative piece of original research. My expectation is that the finished product is publishable with revisions at a peer-reviewed journal or conference. This means the paper should present a clear research question, engage with relevant literature, describe data and methods with enough detail for replication, and interpret results carefully. It should read as a complete manuscript, not a course assignment.</w:t>
       </w:r>
     </w:p>
     <w:p>
@@ -60,12 +53,7 @@
         <w:spacing w:after="200"/>
       </w:pPr>
       <w:r>
-        <w:rPr>
-          <w:rFonts w:ascii="Arial" w:cs="Arial" w:eastAsia="Arial" w:hAnsi="Arial"/>
-          <w:sz w:val="22"/>
-          <w:szCs w:val="22"/>
-        </w:rPr>
-        <w:t xml:space="preserve">All team members are expected to contribute substantively to the research design, analysis, and writing. Uneven contributions will be assessed through a confidential peer evaluation at the end of the semester.</w:t>
+        <w:t>All team members are expected to contribute substantively to the research design, analysis, and writing. Uneven contributions will be assessed through a confidential peer evaluation at the end of the semester.</w:t>
       </w:r>
     </w:p>
     <w:p>
@@ -73,7 +61,7 @@
         <w:pStyle w:val="Heading1"/>
       </w:pPr>
       <w:r>
-        <w:t xml:space="preserve">Format</w:t>
+        <w:t>Format</w:t>
       </w:r>
     </w:p>
     <w:p>
@@ -81,12 +69,7 @@
         <w:spacing w:after="120"/>
       </w:pPr>
       <w:r>
-        <w:rPr>
-          <w:rFonts w:ascii="Arial" w:cs="Arial" w:eastAsia="Arial" w:hAnsi="Arial"/>
-          <w:sz w:val="22"/>
-          <w:szCs w:val="22"/>
-        </w:rPr>
-        <w:t xml:space="preserve">Follow a general science manuscript format. The paper should include the following sections:</w:t>
+        <w:t>Follow a general science manuscript format. The paper should include the following sections:</w:t>
       </w:r>
     </w:p>
     <w:p>
@@ -100,20 +83,12 @@
       </w:pPr>
       <w:r>
         <w:rPr>
-          <w:rFonts w:ascii="Arial" w:cs="Arial" w:eastAsia="Arial" w:hAnsi="Arial"/>
           <w:b/>
           <w:bCs/>
-          <w:sz w:val="22"/>
-          <w:szCs w:val="22"/>
         </w:rPr>
-        <w:t xml:space="preserve">Introduction.</w:t>
-      </w:r>
-      <w:r>
-        <w:rPr>
-          <w:rFonts w:ascii="Arial" w:cs="Arial" w:eastAsia="Arial" w:hAnsi="Arial"/>
-          <w:sz w:val="22"/>
-          <w:szCs w:val="22"/>
-        </w:rPr>
+        <w:t>Introduction.</w:t>
+      </w:r>
+      <w:r>
         <w:t xml:space="preserve"> State the research question, motivate it, and preview the contribution.</w:t>
       </w:r>
     </w:p>
@@ -128,20 +103,12 @@
       </w:pPr>
       <w:r>
         <w:rPr>
-          <w:rFonts w:ascii="Arial" w:cs="Arial" w:eastAsia="Arial" w:hAnsi="Arial"/>
           <w:b/>
           <w:bCs/>
-          <w:sz w:val="22"/>
-          <w:szCs w:val="22"/>
         </w:rPr>
-        <w:t xml:space="preserve">Literature Review.</w:t>
-      </w:r>
-      <w:r>
-        <w:rPr>
-          <w:rFonts w:ascii="Arial" w:cs="Arial" w:eastAsia="Arial" w:hAnsi="Arial"/>
-          <w:sz w:val="22"/>
-          <w:szCs w:val="22"/>
-        </w:rPr>
+        <w:t>Literature Review.</w:t>
+      </w:r>
+      <w:r>
         <w:t xml:space="preserve"> Situate the paper in relevant substantive and methodological literatures. Be selective—cite what matters for your argument.</w:t>
       </w:r>
     </w:p>
@@ -156,20 +123,12 @@
       </w:pPr>
       <w:r>
         <w:rPr>
-          <w:rFonts w:ascii="Arial" w:cs="Arial" w:eastAsia="Arial" w:hAnsi="Arial"/>
           <w:b/>
           <w:bCs/>
-          <w:sz w:val="22"/>
-          <w:szCs w:val="22"/>
         </w:rPr>
-        <w:t xml:space="preserve">Data.</w:t>
-      </w:r>
-      <w:r>
-        <w:rPr>
-          <w:rFonts w:ascii="Arial" w:cs="Arial" w:eastAsia="Arial" w:hAnsi="Arial"/>
-          <w:sz w:val="22"/>
-          <w:szCs w:val="22"/>
-        </w:rPr>
+        <w:t>Data.</w:t>
+      </w:r>
+      <w:r>
         <w:t xml:space="preserve"> Describe the data source(s), collection process, coverage, unit of analysis, and key variables. Discuss limitations and potential biases.</w:t>
       </w:r>
     </w:p>
@@ -184,20 +143,12 @@
       </w:pPr>
       <w:r>
         <w:rPr>
-          <w:rFonts w:ascii="Arial" w:cs="Arial" w:eastAsia="Arial" w:hAnsi="Arial"/>
           <w:b/>
           <w:bCs/>
-          <w:sz w:val="22"/>
-          <w:szCs w:val="22"/>
         </w:rPr>
-        <w:t xml:space="preserve">Methods.</w:t>
-      </w:r>
-      <w:r>
-        <w:rPr>
-          <w:rFonts w:ascii="Arial" w:cs="Arial" w:eastAsia="Arial" w:hAnsi="Arial"/>
-          <w:sz w:val="22"/>
-          <w:szCs w:val="22"/>
-        </w:rPr>
+        <w:t>Methods.</w:t>
+      </w:r>
+      <w:r>
         <w:t xml:space="preserve"> Explain the analytical approach, justify design choices, and state assumptions. A reader should understand what you did and why.</w:t>
       </w:r>
     </w:p>
@@ -212,20 +163,12 @@
       </w:pPr>
       <w:r>
         <w:rPr>
-          <w:rFonts w:ascii="Arial" w:cs="Arial" w:eastAsia="Arial" w:hAnsi="Arial"/>
           <w:b/>
           <w:bCs/>
-          <w:sz w:val="22"/>
-          <w:szCs w:val="22"/>
         </w:rPr>
-        <w:t xml:space="preserve">Results.</w:t>
-      </w:r>
-      <w:r>
-        <w:rPr>
-          <w:rFonts w:ascii="Arial" w:cs="Arial" w:eastAsia="Arial" w:hAnsi="Arial"/>
-          <w:sz w:val="22"/>
-          <w:szCs w:val="22"/>
-        </w:rPr>
+        <w:t>Results.</w:t>
+      </w:r>
+      <w:r>
         <w:t xml:space="preserve"> Present findings with appropriate tables and figures. Interpret results carefully—distinguish what the evidence shows from what you speculate.</w:t>
       </w:r>
     </w:p>
@@ -240,20 +183,12 @@
       </w:pPr>
       <w:r>
         <w:rPr>
-          <w:rFonts w:ascii="Arial" w:cs="Arial" w:eastAsia="Arial" w:hAnsi="Arial"/>
           <w:b/>
           <w:bCs/>
-          <w:sz w:val="22"/>
-          <w:szCs w:val="22"/>
         </w:rPr>
-        <w:t xml:space="preserve">Validation &amp; Robustness.</w:t>
-      </w:r>
-      <w:r>
-        <w:rPr>
-          <w:rFonts w:ascii="Arial" w:cs="Arial" w:eastAsia="Arial" w:hAnsi="Arial"/>
-          <w:sz w:val="22"/>
-          <w:szCs w:val="22"/>
-        </w:rPr>
+        <w:t>Validation &amp; Robustness.</w:t>
+      </w:r>
+      <w:r>
         <w:t xml:space="preserve"> Include at least two substantive checks (e.g., placebo tests, sensitivity analyses, alternative specifications, cross-validation). Discuss what these checks reveal about the main findings.</w:t>
       </w:r>
     </w:p>
@@ -268,20 +203,12 @@
       </w:pPr>
       <w:r>
         <w:rPr>
-          <w:rFonts w:ascii="Arial" w:cs="Arial" w:eastAsia="Arial" w:hAnsi="Arial"/>
           <w:b/>
           <w:bCs/>
-          <w:sz w:val="22"/>
-          <w:szCs w:val="22"/>
         </w:rPr>
-        <w:t xml:space="preserve">Discussion &amp; Conclusion.</w:t>
-      </w:r>
-      <w:r>
-        <w:rPr>
-          <w:rFonts w:ascii="Arial" w:cs="Arial" w:eastAsia="Arial" w:hAnsi="Arial"/>
-          <w:sz w:val="22"/>
-          <w:szCs w:val="22"/>
-        </w:rPr>
+        <w:t>Discussion &amp; Conclusion.</w:t>
+      </w:r>
+      <w:r>
         <w:t xml:space="preserve"> Summarize the contribution, acknowledge limitations, and identify directions for future work.</w:t>
       </w:r>
     </w:p>
@@ -296,20 +223,12 @@
       </w:pPr>
       <w:r>
         <w:rPr>
-          <w:rFonts w:ascii="Arial" w:cs="Arial" w:eastAsia="Arial" w:hAnsi="Arial"/>
           <w:b/>
           <w:bCs/>
-          <w:sz w:val="22"/>
-          <w:szCs w:val="22"/>
         </w:rPr>
-        <w:t xml:space="preserve">References.</w:t>
-      </w:r>
-      <w:r>
-        <w:rPr>
-          <w:rFonts w:ascii="Arial" w:cs="Arial" w:eastAsia="Arial" w:hAnsi="Arial"/>
-          <w:sz w:val="22"/>
-          <w:szCs w:val="22"/>
-        </w:rPr>
+        <w:t>References.</w:t>
+      </w:r>
+      <w:r>
         <w:t xml:space="preserve"> Use a consistent citation style (author-year preferred).</w:t>
       </w:r>
     </w:p>
@@ -318,7 +237,7 @@
         <w:pStyle w:val="Heading1"/>
       </w:pPr>
       <w:r>
-        <w:t xml:space="preserve">Specifications</w:t>
+        <w:t>Specifications</w:t>
       </w:r>
     </w:p>
     <w:p>
@@ -331,12 +250,7 @@
         <w:spacing w:after="80"/>
       </w:pPr>
       <w:r>
-        <w:rPr>
-          <w:rFonts w:ascii="Arial" w:cs="Arial" w:eastAsia="Arial" w:hAnsi="Arial"/>
-          <w:sz w:val="22"/>
-          <w:szCs w:val="22"/>
-        </w:rPr>
-        <w:t xml:space="preserve">Length: No strict page limit. Write what the paper needs—most strong papers in this format are 15–30 pages including tables and figures.</w:t>
+        <w:t>Length: No strict page limit. Write what the paper needs—most strong papers in this format are 15–30 pages including tables and figures.</w:t>
       </w:r>
     </w:p>
     <w:p>
@@ -349,12 +263,7 @@
         <w:spacing w:after="80"/>
       </w:pPr>
       <w:r>
-        <w:rPr>
-          <w:rFonts w:ascii="Arial" w:cs="Arial" w:eastAsia="Arial" w:hAnsi="Arial"/>
-          <w:sz w:val="22"/>
-          <w:szCs w:val="22"/>
-        </w:rPr>
-        <w:t xml:space="preserve">Formatting: 12pt font, 1-inch margins, double-spaced text. Tables and figures may be single-spaced.</w:t>
+        <w:t>Formatting: 12pt font, 1-inch margins, double-spaced text. Tables and figures may be single-spaced.</w:t>
       </w:r>
     </w:p>
     <w:p>
@@ -367,12 +276,7 @@
         <w:spacing w:after="80"/>
       </w:pPr>
       <w:r>
-        <w:rPr>
-          <w:rFonts w:ascii="Arial" w:cs="Arial" w:eastAsia="Arial" w:hAnsi="Arial"/>
-          <w:sz w:val="22"/>
-          <w:szCs w:val="22"/>
-        </w:rPr>
-        <w:t xml:space="preserve">Reproducibility: Submit all code and data (or clear access instructions) alongside the paper. A reader should be able to reproduce your main results.</w:t>
+        <w:t>Reproducibility: Submit all code and data (or clear access instructions) alongside the paper. A reader should be able to reproduce your main results.</w:t>
       </w:r>
     </w:p>
     <w:p>
@@ -385,73 +289,70 @@
         <w:spacing w:after="80"/>
       </w:pPr>
       <w:r>
-        <w:rPr>
-          <w:rFonts w:ascii="Arial" w:cs="Arial" w:eastAsia="Arial" w:hAnsi="Arial"/>
-          <w:sz w:val="22"/>
-          <w:szCs w:val="22"/>
-        </w:rPr>
-        <w:t xml:space="preserve">Submission: One submission per team. Upload the manuscript (PDF), code repository (link or zip), and any supplementary materials to Canvas by the posted deadline.</w:t>
+        <w:t>Submission: One submission per team. Upload the manuscript (PDF), code repository (link or zip), and any supplementary materials to Canvas by the posted deadline.</w:t>
       </w:r>
     </w:p>
     <w:p>
-      <w:r>
-        <w:br w:type="page"/>
+      <w:pPr>
+        <w:pStyle w:val="Heading1"/>
+      </w:pPr>
+      <w:r>
+        <w:lastRenderedPageBreak/>
+        <w:t>Grading Rubric (100 points)</w:t>
       </w:r>
     </w:p>
     <w:p>
       <w:pPr>
-        <w:pStyle w:val="Heading1"/>
-      </w:pPr>
-      <w:r>
-        <w:t xml:space="preserve">Grading Rubric (100 points)</w:t>
-      </w:r>
-    </w:p>
-    <w:p>
-      <w:pPr>
         <w:spacing w:after="200"/>
       </w:pPr>
       <w:r>
-        <w:rPr>
-          <w:rFonts w:ascii="Arial" w:cs="Arial" w:eastAsia="Arial" w:hAnsi="Arial"/>
-          <w:sz w:val="22"/>
-          <w:szCs w:val="22"/>
-        </w:rPr>
-        <w:t xml:space="preserve">Each section is scored independently. The descriptors below indicate the range for each tier; use your judgment within each range based on the quality of the work.</w:t>
+        <w:t>Each section is scored independently. The descriptors below indicate the range for each tier; use your judgment within each range based on the quality of the work.</w:t>
       </w:r>
     </w:p>
     <w:tbl>
       <w:tblPr>
-        <w:tblW w:type="dxa" w:w="9360"/>
+        <w:tblW w:w="9360" w:type="dxa"/>
         <w:tblBorders>
-          <w:top w:val="single" w:color="auto" w:sz="4"/>
-          <w:left w:val="single" w:color="auto" w:sz="4"/>
-          <w:bottom w:val="single" w:color="auto" w:sz="4"/>
-          <w:right w:val="single" w:color="auto" w:sz="4"/>
-          <w:insideH w:val="single" w:color="auto" w:sz="4"/>
-          <w:insideV w:val="single" w:color="auto" w:sz="4"/>
+          <w:top w:val="single" w:sz="4" w:space="0" w:color="auto"/>
+          <w:left w:val="single" w:sz="4" w:space="0" w:color="auto"/>
+          <w:bottom w:val="single" w:sz="4" w:space="0" w:color="auto"/>
+          <w:right w:val="single" w:sz="4" w:space="0" w:color="auto"/>
+          <w:insideH w:val="single" w:sz="4" w:space="0" w:color="auto"/>
+          <w:insideV w:val="single" w:sz="4" w:space="0" w:color="auto"/>
         </w:tblBorders>
+        <w:tblCellMar>
+          <w:left w:w="10" w:type="dxa"/>
+          <w:right w:w="10" w:type="dxa"/>
+        </w:tblCellMar>
+        <w:tblLook w:val="0000" w:firstRow="0" w:lastRow="0" w:firstColumn="0" w:lastColumn="0" w:noHBand="0" w:noVBand="0"/>
       </w:tblPr>
       <w:tblGrid>
-        <w:gridCol w:w="2800"/>
-        <w:gridCol w:w="800"/>
-        <w:gridCol w:w="5760"/>
+        <w:gridCol w:w="2788"/>
+        <w:gridCol w:w="852"/>
+        <w:gridCol w:w="5720"/>
       </w:tblGrid>
       <w:tr>
+        <w:tblPrEx>
+          <w:tblCellMar>
+            <w:top w:w="0" w:type="dxa"/>
+            <w:bottom w:w="0" w:type="dxa"/>
+          </w:tblCellMar>
+        </w:tblPrEx>
         <w:tc>
           <w:tcPr>
-            <w:tcW w:type="dxa" w:w="2800"/>
+            <w:tcW w:w="2800" w:type="dxa"/>
             <w:tcBorders>
-              <w:top w:val="single" w:color="999999" w:sz="1"/>
-              <w:left w:val="single" w:color="999999" w:sz="1"/>
-              <w:bottom w:val="single" w:color="999999" w:sz="1"/>
-              <w:right w:val="single" w:color="999999" w:sz="1"/>
+              <w:top w:val="single" w:sz="1" w:space="0" w:color="999999"/>
+              <w:left w:val="single" w:sz="1" w:space="0" w:color="999999"/>
+              <w:bottom w:val="single" w:sz="1" w:space="0" w:color="999999"/>
+              <w:right w:val="single" w:sz="1" w:space="0" w:color="999999"/>
             </w:tcBorders>
-            <w:shd w:fill="2E2E2E" w:val="clear"/>
+            <w:shd w:val="clear" w:color="auto" w:fill="2E2E2E"/>
             <w:tcMar>
-              <w:top w:type="dxa" w:w="80"/>
-              <w:left w:type="dxa" w:w="120"/>
-              <w:bottom w:type="dxa" w:w="80"/>
-              <w:right w:type="dxa" w:w="120"/>
+              <w:top w:w="80" w:type="dxa"/>
+              <w:left w:w="120" w:type="dxa"/>
+              <w:bottom w:w="80" w:type="dxa"/>
+              <w:right w:w="120" w:type="dxa"/>
             </w:tcMar>
             <w:vAlign w:val="center"/>
           </w:tcPr>
@@ -461,32 +362,31 @@
             </w:pPr>
             <w:r>
               <w:rPr>
-                <w:rFonts w:ascii="Arial" w:cs="Arial" w:eastAsia="Arial" w:hAnsi="Arial"/>
                 <w:b/>
                 <w:bCs/>
                 <w:color w:val="FFFFFF"/>
                 <w:sz w:val="20"/>
                 <w:szCs w:val="20"/>
               </w:rPr>
-              <w:t xml:space="preserve">Section</w:t>
+              <w:t>Section</w:t>
             </w:r>
           </w:p>
         </w:tc>
         <w:tc>
           <w:tcPr>
-            <w:tcW w:type="dxa" w:w="800"/>
+            <w:tcW w:w="800" w:type="dxa"/>
             <w:tcBorders>
-              <w:top w:val="single" w:color="999999" w:sz="1"/>
-              <w:left w:val="single" w:color="999999" w:sz="1"/>
-              <w:bottom w:val="single" w:color="999999" w:sz="1"/>
-              <w:right w:val="single" w:color="999999" w:sz="1"/>
+              <w:top w:val="single" w:sz="1" w:space="0" w:color="999999"/>
+              <w:left w:val="single" w:sz="1" w:space="0" w:color="999999"/>
+              <w:bottom w:val="single" w:sz="1" w:space="0" w:color="999999"/>
+              <w:right w:val="single" w:sz="1" w:space="0" w:color="999999"/>
             </w:tcBorders>
-            <w:shd w:fill="2E2E2E" w:val="clear"/>
+            <w:shd w:val="clear" w:color="auto" w:fill="2E2E2E"/>
             <w:tcMar>
-              <w:top w:type="dxa" w:w="80"/>
-              <w:left w:type="dxa" w:w="120"/>
-              <w:bottom w:type="dxa" w:w="80"/>
-              <w:right w:type="dxa" w:w="120"/>
+              <w:top w:w="80" w:type="dxa"/>
+              <w:left w:w="120" w:type="dxa"/>
+              <w:bottom w:w="80" w:type="dxa"/>
+              <w:right w:w="120" w:type="dxa"/>
             </w:tcMar>
             <w:vAlign w:val="center"/>
           </w:tcPr>
@@ -496,32 +396,31 @@
             </w:pPr>
             <w:r>
               <w:rPr>
-                <w:rFonts w:ascii="Arial" w:cs="Arial" w:eastAsia="Arial" w:hAnsi="Arial"/>
                 <w:b/>
                 <w:bCs/>
                 <w:color w:val="FFFFFF"/>
                 <w:sz w:val="20"/>
                 <w:szCs w:val="20"/>
               </w:rPr>
-              <w:t xml:space="preserve">Points</w:t>
+              <w:t>Points</w:t>
             </w:r>
           </w:p>
         </w:tc>
         <w:tc>
           <w:tcPr>
-            <w:tcW w:type="dxa" w:w="5760"/>
+            <w:tcW w:w="5760" w:type="dxa"/>
             <w:tcBorders>
-              <w:top w:val="single" w:color="999999" w:sz="1"/>
-              <w:left w:val="single" w:color="999999" w:sz="1"/>
-              <w:bottom w:val="single" w:color="999999" w:sz="1"/>
-              <w:right w:val="single" w:color="999999" w:sz="1"/>
+              <w:top w:val="single" w:sz="1" w:space="0" w:color="999999"/>
+              <w:left w:val="single" w:sz="1" w:space="0" w:color="999999"/>
+              <w:bottom w:val="single" w:sz="1" w:space="0" w:color="999999"/>
+              <w:right w:val="single" w:sz="1" w:space="0" w:color="999999"/>
             </w:tcBorders>
-            <w:shd w:fill="2E2E2E" w:val="clear"/>
+            <w:shd w:val="clear" w:color="auto" w:fill="2E2E2E"/>
             <w:tcMar>
-              <w:top w:type="dxa" w:w="80"/>
-              <w:left w:type="dxa" w:w="120"/>
-              <w:bottom w:type="dxa" w:w="80"/>
-              <w:right w:type="dxa" w:w="120"/>
+              <w:top w:w="80" w:type="dxa"/>
+              <w:left w:w="120" w:type="dxa"/>
+              <w:bottom w:w="80" w:type="dxa"/>
+              <w:right w:w="120" w:type="dxa"/>
             </w:tcMar>
             <w:vAlign w:val="center"/>
           </w:tcPr>
@@ -531,36 +430,40 @@
             </w:pPr>
             <w:r>
               <w:rPr>
-                <w:rFonts w:ascii="Arial" w:cs="Arial" w:eastAsia="Arial" w:hAnsi="Arial"/>
                 <w:b/>
                 <w:bCs/>
                 <w:color w:val="FFFFFF"/>
                 <w:sz w:val="20"/>
                 <w:szCs w:val="20"/>
               </w:rPr>
-              <w:t xml:space="preserve">Scoring Guide</w:t>
+              <w:t>Scoring Guide</w:t>
             </w:r>
           </w:p>
         </w:tc>
       </w:tr>
       <w:tr>
+        <w:tblPrEx>
+          <w:tblCellMar>
+            <w:top w:w="0" w:type="dxa"/>
+            <w:bottom w:w="0" w:type="dxa"/>
+          </w:tblCellMar>
+        </w:tblPrEx>
         <w:tc>
           <w:tcPr>
-            <w:tcW w:type="dxa" w:w="2800"/>
+            <w:tcW w:w="2800" w:type="dxa"/>
             <w:tcBorders>
-              <w:top w:val="single" w:color="999999" w:sz="1"/>
-              <w:left w:val="single" w:color="999999" w:sz="1"/>
-              <w:bottom w:val="single" w:color="999999" w:sz="1"/>
-              <w:right w:val="single" w:color="999999" w:sz="1"/>
+              <w:top w:val="single" w:sz="1" w:space="0" w:color="999999"/>
+              <w:left w:val="single" w:sz="1" w:space="0" w:color="999999"/>
+              <w:bottom w:val="single" w:sz="1" w:space="0" w:color="999999"/>
+              <w:right w:val="single" w:sz="1" w:space="0" w:color="999999"/>
             </w:tcBorders>
-            <w:shd w:fill="F5F5F5" w:val="clear"/>
+            <w:shd w:val="clear" w:color="auto" w:fill="F5F5F5"/>
             <w:tcMar>
-              <w:top w:type="dxa" w:w="80"/>
-              <w:left w:type="dxa" w:w="120"/>
-              <w:bottom w:type="dxa" w:w="80"/>
-              <w:right w:type="dxa" w:w="120"/>
+              <w:top w:w="80" w:type="dxa"/>
+              <w:left w:w="120" w:type="dxa"/>
+              <w:bottom w:w="80" w:type="dxa"/>
+              <w:right w:w="120" w:type="dxa"/>
             </w:tcMar>
-            <w:vAlign w:val="top"/>
           </w:tcPr>
           <w:p>
             <w:pPr>
@@ -568,31 +471,29 @@
             </w:pPr>
             <w:r>
               <w:rPr>
-                <w:rFonts w:ascii="Arial" w:cs="Arial" w:eastAsia="Arial" w:hAnsi="Arial"/>
                 <w:sz w:val="20"/>
                 <w:szCs w:val="20"/>
               </w:rPr>
-              <w:t xml:space="preserve">Research Question &amp; Motivation</w:t>
+              <w:t>Research Question &amp; Motivation</w:t>
             </w:r>
           </w:p>
         </w:tc>
         <w:tc>
           <w:tcPr>
-            <w:tcW w:type="dxa" w:w="800"/>
+            <w:tcW w:w="800" w:type="dxa"/>
             <w:tcBorders>
-              <w:top w:val="single" w:color="999999" w:sz="1"/>
-              <w:left w:val="single" w:color="999999" w:sz="1"/>
-              <w:bottom w:val="single" w:color="999999" w:sz="1"/>
-              <w:right w:val="single" w:color="999999" w:sz="1"/>
+              <w:top w:val="single" w:sz="1" w:space="0" w:color="999999"/>
+              <w:left w:val="single" w:sz="1" w:space="0" w:color="999999"/>
+              <w:bottom w:val="single" w:sz="1" w:space="0" w:color="999999"/>
+              <w:right w:val="single" w:sz="1" w:space="0" w:color="999999"/>
             </w:tcBorders>
-            <w:shd w:fill="F5F5F5" w:val="clear"/>
+            <w:shd w:val="clear" w:color="auto" w:fill="F5F5F5"/>
             <w:tcMar>
-              <w:top w:type="dxa" w:w="80"/>
-              <w:left w:type="dxa" w:w="120"/>
-              <w:bottom w:type="dxa" w:w="80"/>
-              <w:right w:type="dxa" w:w="120"/>
+              <w:top w:w="80" w:type="dxa"/>
+              <w:left w:w="120" w:type="dxa"/>
+              <w:bottom w:w="80" w:type="dxa"/>
+              <w:right w:w="120" w:type="dxa"/>
             </w:tcMar>
-            <w:vAlign w:val="top"/>
           </w:tcPr>
           <w:p>
             <w:pPr>
@@ -600,31 +501,29 @@
             </w:pPr>
             <w:r>
               <w:rPr>
-                <w:rFonts w:ascii="Arial" w:cs="Arial" w:eastAsia="Arial" w:hAnsi="Arial"/>
                 <w:sz w:val="20"/>
                 <w:szCs w:val="20"/>
               </w:rPr>
-              <w:t xml:space="preserve">10</w:t>
+              <w:t>10</w:t>
             </w:r>
           </w:p>
         </w:tc>
         <w:tc>
           <w:tcPr>
-            <w:tcW w:type="dxa" w:w="5760"/>
+            <w:tcW w:w="5760" w:type="dxa"/>
             <w:tcBorders>
-              <w:top w:val="single" w:color="999999" w:sz="1"/>
-              <w:left w:val="single" w:color="999999" w:sz="1"/>
-              <w:bottom w:val="single" w:color="999999" w:sz="1"/>
-              <w:right w:val="single" w:color="999999" w:sz="1"/>
+              <w:top w:val="single" w:sz="1" w:space="0" w:color="999999"/>
+              <w:left w:val="single" w:sz="1" w:space="0" w:color="999999"/>
+              <w:bottom w:val="single" w:sz="1" w:space="0" w:color="999999"/>
+              <w:right w:val="single" w:sz="1" w:space="0" w:color="999999"/>
             </w:tcBorders>
-            <w:shd w:fill="F5F5F5" w:val="clear"/>
+            <w:shd w:val="clear" w:color="auto" w:fill="F5F5F5"/>
             <w:tcMar>
-              <w:top w:type="dxa" w:w="80"/>
-              <w:left w:type="dxa" w:w="120"/>
-              <w:bottom w:type="dxa" w:w="80"/>
-              <w:right w:type="dxa" w:w="120"/>
+              <w:top w:w="80" w:type="dxa"/>
+              <w:left w:w="120" w:type="dxa"/>
+              <w:bottom w:w="80" w:type="dxa"/>
+              <w:right w:w="120" w:type="dxa"/>
             </w:tcMar>
-            <w:vAlign w:val="top"/>
           </w:tcPr>
           <w:p>
             <w:pPr>
@@ -632,7 +531,6 @@
             </w:pPr>
             <w:r>
               <w:rPr>
-                <w:rFonts w:ascii="Arial" w:cs="Arial" w:eastAsia="Arial" w:hAnsi="Arial"/>
                 <w:b/>
                 <w:bCs/>
                 <w:sz w:val="18"/>
@@ -642,11 +540,10 @@
             </w:r>
             <w:r>
               <w:rPr>
-                <w:rFonts w:ascii="Arial" w:cs="Arial" w:eastAsia="Arial" w:hAnsi="Arial"/>
-                <w:sz w:val="18"/>
-                <w:szCs w:val="18"/>
-              </w:rPr>
-              <w:t xml:space="preserve">Clear, well-scoped question with explicit theoretical or empirical motivation. Reader understands the stakes immediately.</w:t>
+                <w:sz w:val="18"/>
+                <w:szCs w:val="18"/>
+              </w:rPr>
+              <w:t>Clear, well-scoped question with explicit theoretical or empirical motivation. Reader understands the stakes immediately.</w:t>
             </w:r>
           </w:p>
           <w:p>
@@ -655,7 +552,6 @@
             </w:pPr>
             <w:r>
               <w:rPr>
-                <w:rFonts w:ascii="Arial" w:cs="Arial" w:eastAsia="Arial" w:hAnsi="Arial"/>
                 <w:b/>
                 <w:bCs/>
                 <w:sz w:val="18"/>
@@ -665,11 +561,10 @@
             </w:r>
             <w:r>
               <w:rPr>
-                <w:rFonts w:ascii="Arial" w:cs="Arial" w:eastAsia="Arial" w:hAnsi="Arial"/>
-                <w:sz w:val="18"/>
-                <w:szCs w:val="18"/>
-              </w:rPr>
-              <w:t xml:space="preserve">Question is identifiable but motivation is underdeveloped or the scope is too broad.</w:t>
+                <w:sz w:val="18"/>
+                <w:szCs w:val="18"/>
+              </w:rPr>
+              <w:t>Question is identifiable but motivation is underdeveloped or the scope is too broad.</w:t>
             </w:r>
           </w:p>
           <w:p>
@@ -678,7 +573,6 @@
             </w:pPr>
             <w:r>
               <w:rPr>
-                <w:rFonts w:ascii="Arial" w:cs="Arial" w:eastAsia="Arial" w:hAnsi="Arial"/>
                 <w:b/>
                 <w:bCs/>
                 <w:sz w:val="18"/>
@@ -688,32 +582,36 @@
             </w:r>
             <w:r>
               <w:rPr>
-                <w:rFonts w:ascii="Arial" w:cs="Arial" w:eastAsia="Arial" w:hAnsi="Arial"/>
-                <w:sz w:val="18"/>
-                <w:szCs w:val="18"/>
-              </w:rPr>
-              <w:t xml:space="preserve">Question is vague, missing, or disconnected from the rest of the paper.</w:t>
+                <w:sz w:val="18"/>
+                <w:szCs w:val="18"/>
+              </w:rPr>
+              <w:t>Question is vague, missing, or disconnected from the rest of the paper.</w:t>
             </w:r>
           </w:p>
         </w:tc>
       </w:tr>
       <w:tr>
+        <w:tblPrEx>
+          <w:tblCellMar>
+            <w:top w:w="0" w:type="dxa"/>
+            <w:bottom w:w="0" w:type="dxa"/>
+          </w:tblCellMar>
+        </w:tblPrEx>
         <w:tc>
           <w:tcPr>
-            <w:tcW w:type="dxa" w:w="2800"/>
+            <w:tcW w:w="2800" w:type="dxa"/>
             <w:tcBorders>
-              <w:top w:val="single" w:color="999999" w:sz="1"/>
-              <w:left w:val="single" w:color="999999" w:sz="1"/>
-              <w:bottom w:val="single" w:color="999999" w:sz="1"/>
-              <w:right w:val="single" w:color="999999" w:sz="1"/>
+              <w:top w:val="single" w:sz="1" w:space="0" w:color="999999"/>
+              <w:left w:val="single" w:sz="1" w:space="0" w:color="999999"/>
+              <w:bottom w:val="single" w:sz="1" w:space="0" w:color="999999"/>
+              <w:right w:val="single" w:sz="1" w:space="0" w:color="999999"/>
             </w:tcBorders>
             <w:tcMar>
-              <w:top w:type="dxa" w:w="80"/>
-              <w:left w:type="dxa" w:w="120"/>
-              <w:bottom w:type="dxa" w:w="80"/>
-              <w:right w:type="dxa" w:w="120"/>
+              <w:top w:w="80" w:type="dxa"/>
+              <w:left w:w="120" w:type="dxa"/>
+              <w:bottom w:w="80" w:type="dxa"/>
+              <w:right w:w="120" w:type="dxa"/>
             </w:tcMar>
-            <w:vAlign w:val="top"/>
           </w:tcPr>
           <w:p>
             <w:pPr>
@@ -721,30 +619,28 @@
             </w:pPr>
             <w:r>
               <w:rPr>
-                <w:rFonts w:ascii="Arial" w:cs="Arial" w:eastAsia="Arial" w:hAnsi="Arial"/>
                 <w:sz w:val="20"/>
                 <w:szCs w:val="20"/>
               </w:rPr>
-              <w:t xml:space="preserve">Literature &amp; Contribution</w:t>
+              <w:t>Literature &amp; Contribution</w:t>
             </w:r>
           </w:p>
         </w:tc>
         <w:tc>
           <w:tcPr>
-            <w:tcW w:type="dxa" w:w="800"/>
+            <w:tcW w:w="800" w:type="dxa"/>
             <w:tcBorders>
-              <w:top w:val="single" w:color="999999" w:sz="1"/>
-              <w:left w:val="single" w:color="999999" w:sz="1"/>
-              <w:bottom w:val="single" w:color="999999" w:sz="1"/>
-              <w:right w:val="single" w:color="999999" w:sz="1"/>
+              <w:top w:val="single" w:sz="1" w:space="0" w:color="999999"/>
+              <w:left w:val="single" w:sz="1" w:space="0" w:color="999999"/>
+              <w:bottom w:val="single" w:sz="1" w:space="0" w:color="999999"/>
+              <w:right w:val="single" w:sz="1" w:space="0" w:color="999999"/>
             </w:tcBorders>
             <w:tcMar>
-              <w:top w:type="dxa" w:w="80"/>
-              <w:left w:type="dxa" w:w="120"/>
-              <w:bottom w:type="dxa" w:w="80"/>
-              <w:right w:type="dxa" w:w="120"/>
+              <w:top w:w="80" w:type="dxa"/>
+              <w:left w:w="120" w:type="dxa"/>
+              <w:bottom w:w="80" w:type="dxa"/>
+              <w:right w:w="120" w:type="dxa"/>
             </w:tcMar>
-            <w:vAlign w:val="top"/>
           </w:tcPr>
           <w:p>
             <w:pPr>
@@ -752,30 +648,28 @@
             </w:pPr>
             <w:r>
               <w:rPr>
-                <w:rFonts w:ascii="Arial" w:cs="Arial" w:eastAsia="Arial" w:hAnsi="Arial"/>
                 <w:sz w:val="20"/>
                 <w:szCs w:val="20"/>
               </w:rPr>
-              <w:t xml:space="preserve">15</w:t>
+              <w:t>15</w:t>
             </w:r>
           </w:p>
         </w:tc>
         <w:tc>
           <w:tcPr>
-            <w:tcW w:type="dxa" w:w="5760"/>
+            <w:tcW w:w="5760" w:type="dxa"/>
             <w:tcBorders>
-              <w:top w:val="single" w:color="999999" w:sz="1"/>
-              <w:left w:val="single" w:color="999999" w:sz="1"/>
-              <w:bottom w:val="single" w:color="999999" w:sz="1"/>
-              <w:right w:val="single" w:color="999999" w:sz="1"/>
+              <w:top w:val="single" w:sz="1" w:space="0" w:color="999999"/>
+              <w:left w:val="single" w:sz="1" w:space="0" w:color="999999"/>
+              <w:bottom w:val="single" w:sz="1" w:space="0" w:color="999999"/>
+              <w:right w:val="single" w:sz="1" w:space="0" w:color="999999"/>
             </w:tcBorders>
             <w:tcMar>
-              <w:top w:type="dxa" w:w="80"/>
-              <w:left w:type="dxa" w:w="120"/>
-              <w:bottom w:type="dxa" w:w="80"/>
-              <w:right w:type="dxa" w:w="120"/>
+              <w:top w:w="80" w:type="dxa"/>
+              <w:left w:w="120" w:type="dxa"/>
+              <w:bottom w:w="80" w:type="dxa"/>
+              <w:right w:w="120" w:type="dxa"/>
             </w:tcMar>
-            <w:vAlign w:val="top"/>
           </w:tcPr>
           <w:p>
             <w:pPr>
@@ -783,7 +677,6 @@
             </w:pPr>
             <w:r>
               <w:rPr>
-                <w:rFonts w:ascii="Arial" w:cs="Arial" w:eastAsia="Arial" w:hAnsi="Arial"/>
                 <w:b/>
                 <w:bCs/>
                 <w:sz w:val="18"/>
@@ -793,11 +686,10 @@
             </w:r>
             <w:r>
               <w:rPr>
-                <w:rFonts w:ascii="Arial" w:cs="Arial" w:eastAsia="Arial" w:hAnsi="Arial"/>
-                <w:sz w:val="18"/>
-                <w:szCs w:val="18"/>
-              </w:rPr>
-              <w:t xml:space="preserve">Engages substantively with relevant literature. Contribution is clearly positioned relative to prior work.</w:t>
+                <w:sz w:val="18"/>
+                <w:szCs w:val="18"/>
+              </w:rPr>
+              <w:t>Engages substantively with relevant literature. Contribution is clearly positioned relative to prior work.</w:t>
             </w:r>
           </w:p>
           <w:p>
@@ -806,7 +698,6 @@
             </w:pPr>
             <w:r>
               <w:rPr>
-                <w:rFonts w:ascii="Arial" w:cs="Arial" w:eastAsia="Arial" w:hAnsi="Arial"/>
                 <w:b/>
                 <w:bCs/>
                 <w:sz w:val="18"/>
@@ -816,11 +707,10 @@
             </w:r>
             <w:r>
               <w:rPr>
-                <w:rFonts w:ascii="Arial" w:cs="Arial" w:eastAsia="Arial" w:hAnsi="Arial"/>
-                <w:sz w:val="18"/>
-                <w:szCs w:val="18"/>
-              </w:rPr>
-              <w:t xml:space="preserve">Literature is present but shallow or disconnected from the paper’s claims.</w:t>
+                <w:sz w:val="18"/>
+                <w:szCs w:val="18"/>
+              </w:rPr>
+              <w:t>Literature is present but shallow or disconnected from the paper’s claims.</w:t>
             </w:r>
           </w:p>
           <w:p>
@@ -829,7 +719,6 @@
             </w:pPr>
             <w:r>
               <w:rPr>
-                <w:rFonts w:ascii="Arial" w:cs="Arial" w:eastAsia="Arial" w:hAnsi="Arial"/>
                 <w:b/>
                 <w:bCs/>
                 <w:sz w:val="18"/>
@@ -839,33 +728,37 @@
             </w:r>
             <w:r>
               <w:rPr>
-                <w:rFonts w:ascii="Arial" w:cs="Arial" w:eastAsia="Arial" w:hAnsi="Arial"/>
-                <w:sz w:val="18"/>
-                <w:szCs w:val="18"/>
-              </w:rPr>
-              <w:t xml:space="preserve">Missing or perfunctory literature review; contribution is unclear.</w:t>
+                <w:sz w:val="18"/>
+                <w:szCs w:val="18"/>
+              </w:rPr>
+              <w:t>Missing or perfunctory literature review; contribution is unclear.</w:t>
             </w:r>
           </w:p>
         </w:tc>
       </w:tr>
       <w:tr>
+        <w:tblPrEx>
+          <w:tblCellMar>
+            <w:top w:w="0" w:type="dxa"/>
+            <w:bottom w:w="0" w:type="dxa"/>
+          </w:tblCellMar>
+        </w:tblPrEx>
         <w:tc>
           <w:tcPr>
-            <w:tcW w:type="dxa" w:w="2800"/>
+            <w:tcW w:w="2800" w:type="dxa"/>
             <w:tcBorders>
-              <w:top w:val="single" w:color="999999" w:sz="1"/>
-              <w:left w:val="single" w:color="999999" w:sz="1"/>
-              <w:bottom w:val="single" w:color="999999" w:sz="1"/>
-              <w:right w:val="single" w:color="999999" w:sz="1"/>
+              <w:top w:val="single" w:sz="1" w:space="0" w:color="999999"/>
+              <w:left w:val="single" w:sz="1" w:space="0" w:color="999999"/>
+              <w:bottom w:val="single" w:sz="1" w:space="0" w:color="999999"/>
+              <w:right w:val="single" w:sz="1" w:space="0" w:color="999999"/>
             </w:tcBorders>
-            <w:shd w:fill="F5F5F5" w:val="clear"/>
+            <w:shd w:val="clear" w:color="auto" w:fill="F5F5F5"/>
             <w:tcMar>
-              <w:top w:type="dxa" w:w="80"/>
-              <w:left w:type="dxa" w:w="120"/>
-              <w:bottom w:type="dxa" w:w="80"/>
-              <w:right w:type="dxa" w:w="120"/>
+              <w:top w:w="80" w:type="dxa"/>
+              <w:left w:w="120" w:type="dxa"/>
+              <w:bottom w:w="80" w:type="dxa"/>
+              <w:right w:w="120" w:type="dxa"/>
             </w:tcMar>
-            <w:vAlign w:val="top"/>
           </w:tcPr>
           <w:p>
             <w:pPr>
@@ -873,31 +766,29 @@
             </w:pPr>
             <w:r>
               <w:rPr>
-                <w:rFonts w:ascii="Arial" w:cs="Arial" w:eastAsia="Arial" w:hAnsi="Arial"/>
                 <w:sz w:val="20"/>
                 <w:szCs w:val="20"/>
               </w:rPr>
-              <w:t xml:space="preserve">Data &amp; Provenance</w:t>
+              <w:t>Data &amp; Provenance</w:t>
             </w:r>
           </w:p>
         </w:tc>
         <w:tc>
           <w:tcPr>
-            <w:tcW w:type="dxa" w:w="800"/>
+            <w:tcW w:w="800" w:type="dxa"/>
             <w:tcBorders>
-              <w:top w:val="single" w:color="999999" w:sz="1"/>
-              <w:left w:val="single" w:color="999999" w:sz="1"/>
-              <w:bottom w:val="single" w:color="999999" w:sz="1"/>
-              <w:right w:val="single" w:color="999999" w:sz="1"/>
+              <w:top w:val="single" w:sz="1" w:space="0" w:color="999999"/>
+              <w:left w:val="single" w:sz="1" w:space="0" w:color="999999"/>
+              <w:bottom w:val="single" w:sz="1" w:space="0" w:color="999999"/>
+              <w:right w:val="single" w:sz="1" w:space="0" w:color="999999"/>
             </w:tcBorders>
-            <w:shd w:fill="F5F5F5" w:val="clear"/>
+            <w:shd w:val="clear" w:color="auto" w:fill="F5F5F5"/>
             <w:tcMar>
-              <w:top w:type="dxa" w:w="80"/>
-              <w:left w:type="dxa" w:w="120"/>
-              <w:bottom w:type="dxa" w:w="80"/>
-              <w:right w:type="dxa" w:w="120"/>
+              <w:top w:w="80" w:type="dxa"/>
+              <w:left w:w="120" w:type="dxa"/>
+              <w:bottom w:w="80" w:type="dxa"/>
+              <w:right w:w="120" w:type="dxa"/>
             </w:tcMar>
-            <w:vAlign w:val="top"/>
           </w:tcPr>
           <w:p>
             <w:pPr>
@@ -905,31 +796,29 @@
             </w:pPr>
             <w:r>
               <w:rPr>
-                <w:rFonts w:ascii="Arial" w:cs="Arial" w:eastAsia="Arial" w:hAnsi="Arial"/>
                 <w:sz w:val="20"/>
                 <w:szCs w:val="20"/>
               </w:rPr>
-              <w:t xml:space="preserve">15</w:t>
+              <w:t>15</w:t>
             </w:r>
           </w:p>
         </w:tc>
         <w:tc>
           <w:tcPr>
-            <w:tcW w:type="dxa" w:w="5760"/>
+            <w:tcW w:w="5760" w:type="dxa"/>
             <w:tcBorders>
-              <w:top w:val="single" w:color="999999" w:sz="1"/>
-              <w:left w:val="single" w:color="999999" w:sz="1"/>
-              <w:bottom w:val="single" w:color="999999" w:sz="1"/>
-              <w:right w:val="single" w:color="999999" w:sz="1"/>
+              <w:top w:val="single" w:sz="1" w:space="0" w:color="999999"/>
+              <w:left w:val="single" w:sz="1" w:space="0" w:color="999999"/>
+              <w:bottom w:val="single" w:sz="1" w:space="0" w:color="999999"/>
+              <w:right w:val="single" w:sz="1" w:space="0" w:color="999999"/>
             </w:tcBorders>
-            <w:shd w:fill="F5F5F5" w:val="clear"/>
+            <w:shd w:val="clear" w:color="auto" w:fill="F5F5F5"/>
             <w:tcMar>
-              <w:top w:type="dxa" w:w="80"/>
-              <w:left w:type="dxa" w:w="120"/>
-              <w:bottom w:type="dxa" w:w="80"/>
-              <w:right w:type="dxa" w:w="120"/>
+              <w:top w:w="80" w:type="dxa"/>
+              <w:left w:w="120" w:type="dxa"/>
+              <w:bottom w:w="80" w:type="dxa"/>
+              <w:right w:w="120" w:type="dxa"/>
             </w:tcMar>
-            <w:vAlign w:val="top"/>
           </w:tcPr>
           <w:p>
             <w:pPr>
@@ -937,7 +826,6 @@
             </w:pPr>
             <w:r>
               <w:rPr>
-                <w:rFonts w:ascii="Arial" w:cs="Arial" w:eastAsia="Arial" w:hAnsi="Arial"/>
                 <w:b/>
                 <w:bCs/>
                 <w:sz w:val="18"/>
@@ -947,11 +835,10 @@
             </w:r>
             <w:r>
               <w:rPr>
-                <w:rFonts w:ascii="Arial" w:cs="Arial" w:eastAsia="Arial" w:hAnsi="Arial"/>
-                <w:sz w:val="18"/>
-                <w:szCs w:val="18"/>
-              </w:rPr>
-              <w:t xml:space="preserve">Data sources, collection process, coverage, and limitations are fully documented. Reader could assess fitness for purpose.</w:t>
+                <w:sz w:val="18"/>
+                <w:szCs w:val="18"/>
+              </w:rPr>
+              <w:t>Data sources, collection process, coverage, and limitations are fully documented. Reader could assess fitness for purpose.</w:t>
             </w:r>
           </w:p>
           <w:p>
@@ -960,7 +847,6 @@
             </w:pPr>
             <w:r>
               <w:rPr>
-                <w:rFonts w:ascii="Arial" w:cs="Arial" w:eastAsia="Arial" w:hAnsi="Arial"/>
                 <w:b/>
                 <w:bCs/>
                 <w:sz w:val="18"/>
@@ -970,11 +856,10 @@
             </w:r>
             <w:r>
               <w:rPr>
-                <w:rFonts w:ascii="Arial" w:cs="Arial" w:eastAsia="Arial" w:hAnsi="Arial"/>
-                <w:sz w:val="18"/>
-                <w:szCs w:val="18"/>
-              </w:rPr>
-              <w:t xml:space="preserve">Data described but key details (coverage, missingness, time period) are missing.</w:t>
+                <w:sz w:val="18"/>
+                <w:szCs w:val="18"/>
+              </w:rPr>
+              <w:t>Data described but key details (coverage, missingness, time period) are missing.</w:t>
             </w:r>
           </w:p>
           <w:p>
@@ -983,7 +868,6 @@
             </w:pPr>
             <w:r>
               <w:rPr>
-                <w:rFonts w:ascii="Arial" w:cs="Arial" w:eastAsia="Arial" w:hAnsi="Arial"/>
                 <w:b/>
                 <w:bCs/>
                 <w:sz w:val="18"/>
@@ -993,32 +877,36 @@
             </w:r>
             <w:r>
               <w:rPr>
-                <w:rFonts w:ascii="Arial" w:cs="Arial" w:eastAsia="Arial" w:hAnsi="Arial"/>
-                <w:sz w:val="18"/>
-                <w:szCs w:val="18"/>
-              </w:rPr>
-              <w:t xml:space="preserve">Data source unclear or undocumented; provenance cannot be evaluated.</w:t>
+                <w:sz w:val="18"/>
+                <w:szCs w:val="18"/>
+              </w:rPr>
+              <w:t>Data source unclear or undocumented; provenance cannot be evaluated.</w:t>
             </w:r>
           </w:p>
         </w:tc>
       </w:tr>
       <w:tr>
+        <w:tblPrEx>
+          <w:tblCellMar>
+            <w:top w:w="0" w:type="dxa"/>
+            <w:bottom w:w="0" w:type="dxa"/>
+          </w:tblCellMar>
+        </w:tblPrEx>
         <w:tc>
           <w:tcPr>
-            <w:tcW w:type="dxa" w:w="2800"/>
+            <w:tcW w:w="2800" w:type="dxa"/>
             <w:tcBorders>
-              <w:top w:val="single" w:color="999999" w:sz="1"/>
-              <w:left w:val="single" w:color="999999" w:sz="1"/>
-              <w:bottom w:val="single" w:color="999999" w:sz="1"/>
-              <w:right w:val="single" w:color="999999" w:sz="1"/>
+              <w:top w:val="single" w:sz="1" w:space="0" w:color="999999"/>
+              <w:left w:val="single" w:sz="1" w:space="0" w:color="999999"/>
+              <w:bottom w:val="single" w:sz="1" w:space="0" w:color="999999"/>
+              <w:right w:val="single" w:sz="1" w:space="0" w:color="999999"/>
             </w:tcBorders>
             <w:tcMar>
-              <w:top w:type="dxa" w:w="80"/>
-              <w:left w:type="dxa" w:w="120"/>
-              <w:bottom w:type="dxa" w:w="80"/>
-              <w:right w:type="dxa" w:w="120"/>
+              <w:top w:w="80" w:type="dxa"/>
+              <w:left w:w="120" w:type="dxa"/>
+              <w:bottom w:w="80" w:type="dxa"/>
+              <w:right w:w="120" w:type="dxa"/>
             </w:tcMar>
-            <w:vAlign w:val="top"/>
           </w:tcPr>
           <w:p>
             <w:pPr>
@@ -1026,30 +914,28 @@
             </w:pPr>
             <w:r>
               <w:rPr>
-                <w:rFonts w:ascii="Arial" w:cs="Arial" w:eastAsia="Arial" w:hAnsi="Arial"/>
                 <w:sz w:val="20"/>
                 <w:szCs w:val="20"/>
               </w:rPr>
-              <w:t xml:space="preserve">Methods &amp; Pipeline</w:t>
+              <w:t>Methods &amp; Pipeline</w:t>
             </w:r>
           </w:p>
         </w:tc>
         <w:tc>
           <w:tcPr>
-            <w:tcW w:type="dxa" w:w="800"/>
+            <w:tcW w:w="800" w:type="dxa"/>
             <w:tcBorders>
-              <w:top w:val="single" w:color="999999" w:sz="1"/>
-              <w:left w:val="single" w:color="999999" w:sz="1"/>
-              <w:bottom w:val="single" w:color="999999" w:sz="1"/>
-              <w:right w:val="single" w:color="999999" w:sz="1"/>
+              <w:top w:val="single" w:sz="1" w:space="0" w:color="999999"/>
+              <w:left w:val="single" w:sz="1" w:space="0" w:color="999999"/>
+              <w:bottom w:val="single" w:sz="1" w:space="0" w:color="999999"/>
+              <w:right w:val="single" w:sz="1" w:space="0" w:color="999999"/>
             </w:tcBorders>
             <w:tcMar>
-              <w:top w:type="dxa" w:w="80"/>
-              <w:left w:type="dxa" w:w="120"/>
-              <w:bottom w:type="dxa" w:w="80"/>
-              <w:right w:type="dxa" w:w="120"/>
+              <w:top w:w="80" w:type="dxa"/>
+              <w:left w:w="120" w:type="dxa"/>
+              <w:bottom w:w="80" w:type="dxa"/>
+              <w:right w:w="120" w:type="dxa"/>
             </w:tcMar>
-            <w:vAlign w:val="top"/>
           </w:tcPr>
           <w:p>
             <w:pPr>
@@ -1057,30 +943,28 @@
             </w:pPr>
             <w:r>
               <w:rPr>
-                <w:rFonts w:ascii="Arial" w:cs="Arial" w:eastAsia="Arial" w:hAnsi="Arial"/>
                 <w:sz w:val="20"/>
                 <w:szCs w:val="20"/>
               </w:rPr>
-              <w:t xml:space="preserve">20</w:t>
+              <w:t>20</w:t>
             </w:r>
           </w:p>
         </w:tc>
         <w:tc>
           <w:tcPr>
-            <w:tcW w:type="dxa" w:w="5760"/>
+            <w:tcW w:w="5760" w:type="dxa"/>
             <w:tcBorders>
-              <w:top w:val="single" w:color="999999" w:sz="1"/>
-              <w:left w:val="single" w:color="999999" w:sz="1"/>
-              <w:bottom w:val="single" w:color="999999" w:sz="1"/>
-              <w:right w:val="single" w:color="999999" w:sz="1"/>
+              <w:top w:val="single" w:sz="1" w:space="0" w:color="999999"/>
+              <w:left w:val="single" w:sz="1" w:space="0" w:color="999999"/>
+              <w:bottom w:val="single" w:sz="1" w:space="0" w:color="999999"/>
+              <w:right w:val="single" w:sz="1" w:space="0" w:color="999999"/>
             </w:tcBorders>
             <w:tcMar>
-              <w:top w:type="dxa" w:w="80"/>
-              <w:left w:type="dxa" w:w="120"/>
-              <w:bottom w:type="dxa" w:w="80"/>
-              <w:right w:type="dxa" w:w="120"/>
+              <w:top w:w="80" w:type="dxa"/>
+              <w:left w:w="120" w:type="dxa"/>
+              <w:bottom w:w="80" w:type="dxa"/>
+              <w:right w:w="120" w:type="dxa"/>
             </w:tcMar>
-            <w:vAlign w:val="top"/>
           </w:tcPr>
           <w:p>
             <w:pPr>
@@ -1088,7 +972,6 @@
             </w:pPr>
             <w:r>
               <w:rPr>
-                <w:rFonts w:ascii="Arial" w:cs="Arial" w:eastAsia="Arial" w:hAnsi="Arial"/>
                 <w:b/>
                 <w:bCs/>
                 <w:sz w:val="18"/>
@@ -1098,11 +981,10 @@
             </w:r>
             <w:r>
               <w:rPr>
-                <w:rFonts w:ascii="Arial" w:cs="Arial" w:eastAsia="Arial" w:hAnsi="Arial"/>
-                <w:sz w:val="18"/>
-                <w:szCs w:val="18"/>
-              </w:rPr>
-              <w:t xml:space="preserve">Method is appropriate for the question. Pipeline is clearly described with justified design choices. Assumptions are stated.</w:t>
+                <w:sz w:val="18"/>
+                <w:szCs w:val="18"/>
+              </w:rPr>
+              <w:t>Method is appropriate for the question. Pipeline is clearly described with justified design choices. Assumptions are stated.</w:t>
             </w:r>
           </w:p>
           <w:p>
@@ -1111,7 +993,6 @@
             </w:pPr>
             <w:r>
               <w:rPr>
-                <w:rFonts w:ascii="Arial" w:cs="Arial" w:eastAsia="Arial" w:hAnsi="Arial"/>
                 <w:b/>
                 <w:bCs/>
                 <w:sz w:val="18"/>
@@ -1121,11 +1002,10 @@
             </w:r>
             <w:r>
               <w:rPr>
-                <w:rFonts w:ascii="Arial" w:cs="Arial" w:eastAsia="Arial" w:hAnsi="Arial"/>
-                <w:sz w:val="18"/>
-                <w:szCs w:val="18"/>
-              </w:rPr>
-              <w:t xml:space="preserve">Method is reasonable but some choices are unjustified or alternatives are not considered.</w:t>
+                <w:sz w:val="18"/>
+                <w:szCs w:val="18"/>
+              </w:rPr>
+              <w:t>Method is reasonable but some choices are unjustified or alternatives are not considered.</w:t>
             </w:r>
           </w:p>
           <w:p>
@@ -1134,7 +1014,6 @@
             </w:pPr>
             <w:r>
               <w:rPr>
-                <w:rFonts w:ascii="Arial" w:cs="Arial" w:eastAsia="Arial" w:hAnsi="Arial"/>
                 <w:b/>
                 <w:bCs/>
                 <w:sz w:val="18"/>
@@ -1144,33 +1023,37 @@
             </w:r>
             <w:r>
               <w:rPr>
-                <w:rFonts w:ascii="Arial" w:cs="Arial" w:eastAsia="Arial" w:hAnsi="Arial"/>
-                <w:sz w:val="18"/>
-                <w:szCs w:val="18"/>
-              </w:rPr>
-              <w:t xml:space="preserve">Method is inappropriate, poorly described, or disconnected from the research question.</w:t>
+                <w:sz w:val="18"/>
+                <w:szCs w:val="18"/>
+              </w:rPr>
+              <w:t>Method is inappropriate, poorly described, or disconnected from the research question.</w:t>
             </w:r>
           </w:p>
         </w:tc>
       </w:tr>
       <w:tr>
+        <w:tblPrEx>
+          <w:tblCellMar>
+            <w:top w:w="0" w:type="dxa"/>
+            <w:bottom w:w="0" w:type="dxa"/>
+          </w:tblCellMar>
+        </w:tblPrEx>
         <w:tc>
           <w:tcPr>
-            <w:tcW w:type="dxa" w:w="2800"/>
+            <w:tcW w:w="2800" w:type="dxa"/>
             <w:tcBorders>
-              <w:top w:val="single" w:color="999999" w:sz="1"/>
-              <w:left w:val="single" w:color="999999" w:sz="1"/>
-              <w:bottom w:val="single" w:color="999999" w:sz="1"/>
-              <w:right w:val="single" w:color="999999" w:sz="1"/>
+              <w:top w:val="single" w:sz="1" w:space="0" w:color="999999"/>
+              <w:left w:val="single" w:sz="1" w:space="0" w:color="999999"/>
+              <w:bottom w:val="single" w:sz="1" w:space="0" w:color="999999"/>
+              <w:right w:val="single" w:sz="1" w:space="0" w:color="999999"/>
             </w:tcBorders>
-            <w:shd w:fill="F5F5F5" w:val="clear"/>
+            <w:shd w:val="clear" w:color="auto" w:fill="F5F5F5"/>
             <w:tcMar>
-              <w:top w:type="dxa" w:w="80"/>
-              <w:left w:type="dxa" w:w="120"/>
-              <w:bottom w:type="dxa" w:w="80"/>
-              <w:right w:type="dxa" w:w="120"/>
+              <w:top w:w="80" w:type="dxa"/>
+              <w:left w:w="120" w:type="dxa"/>
+              <w:bottom w:w="80" w:type="dxa"/>
+              <w:right w:w="120" w:type="dxa"/>
             </w:tcMar>
-            <w:vAlign w:val="top"/>
           </w:tcPr>
           <w:p>
             <w:pPr>
@@ -1178,31 +1061,29 @@
             </w:pPr>
             <w:r>
               <w:rPr>
-                <w:rFonts w:ascii="Arial" w:cs="Arial" w:eastAsia="Arial" w:hAnsi="Arial"/>
                 <w:sz w:val="20"/>
                 <w:szCs w:val="20"/>
               </w:rPr>
-              <w:t xml:space="preserve">Results &amp; Interpretation</w:t>
+              <w:t>Results &amp; Interpretation</w:t>
             </w:r>
           </w:p>
         </w:tc>
         <w:tc>
           <w:tcPr>
-            <w:tcW w:type="dxa" w:w="800"/>
+            <w:tcW w:w="800" w:type="dxa"/>
             <w:tcBorders>
-              <w:top w:val="single" w:color="999999" w:sz="1"/>
-              <w:left w:val="single" w:color="999999" w:sz="1"/>
-              <w:bottom w:val="single" w:color="999999" w:sz="1"/>
-              <w:right w:val="single" w:color="999999" w:sz="1"/>
+              <w:top w:val="single" w:sz="1" w:space="0" w:color="999999"/>
+              <w:left w:val="single" w:sz="1" w:space="0" w:color="999999"/>
+              <w:bottom w:val="single" w:sz="1" w:space="0" w:color="999999"/>
+              <w:right w:val="single" w:sz="1" w:space="0" w:color="999999"/>
             </w:tcBorders>
-            <w:shd w:fill="F5F5F5" w:val="clear"/>
+            <w:shd w:val="clear" w:color="auto" w:fill="F5F5F5"/>
             <w:tcMar>
-              <w:top w:type="dxa" w:w="80"/>
-              <w:left w:type="dxa" w:w="120"/>
-              <w:bottom w:type="dxa" w:w="80"/>
-              <w:right w:type="dxa" w:w="120"/>
+              <w:top w:w="80" w:type="dxa"/>
+              <w:left w:w="120" w:type="dxa"/>
+              <w:bottom w:w="80" w:type="dxa"/>
+              <w:right w:w="120" w:type="dxa"/>
             </w:tcMar>
-            <w:vAlign w:val="top"/>
           </w:tcPr>
           <w:p>
             <w:pPr>
@@ -1210,31 +1091,29 @@
             </w:pPr>
             <w:r>
               <w:rPr>
-                <w:rFonts w:ascii="Arial" w:cs="Arial" w:eastAsia="Arial" w:hAnsi="Arial"/>
                 <w:sz w:val="20"/>
                 <w:szCs w:val="20"/>
               </w:rPr>
-              <w:t xml:space="preserve">15</w:t>
+              <w:t>15</w:t>
             </w:r>
           </w:p>
         </w:tc>
         <w:tc>
           <w:tcPr>
-            <w:tcW w:type="dxa" w:w="5760"/>
+            <w:tcW w:w="5760" w:type="dxa"/>
             <w:tcBorders>
-              <w:top w:val="single" w:color="999999" w:sz="1"/>
-              <w:left w:val="single" w:color="999999" w:sz="1"/>
-              <w:bottom w:val="single" w:color="999999" w:sz="1"/>
-              <w:right w:val="single" w:color="999999" w:sz="1"/>
+              <w:top w:val="single" w:sz="1" w:space="0" w:color="999999"/>
+              <w:left w:val="single" w:sz="1" w:space="0" w:color="999999"/>
+              <w:bottom w:val="single" w:sz="1" w:space="0" w:color="999999"/>
+              <w:right w:val="single" w:sz="1" w:space="0" w:color="999999"/>
             </w:tcBorders>
-            <w:shd w:fill="F5F5F5" w:val="clear"/>
+            <w:shd w:val="clear" w:color="auto" w:fill="F5F5F5"/>
             <w:tcMar>
-              <w:top w:type="dxa" w:w="80"/>
-              <w:left w:type="dxa" w:w="120"/>
-              <w:bottom w:type="dxa" w:w="80"/>
-              <w:right w:type="dxa" w:w="120"/>
+              <w:top w:w="80" w:type="dxa"/>
+              <w:left w:w="120" w:type="dxa"/>
+              <w:bottom w:w="80" w:type="dxa"/>
+              <w:right w:w="120" w:type="dxa"/>
             </w:tcMar>
-            <w:vAlign w:val="top"/>
           </w:tcPr>
           <w:p>
             <w:pPr>
@@ -1242,7 +1121,6 @@
             </w:pPr>
             <w:r>
               <w:rPr>
-                <w:rFonts w:ascii="Arial" w:cs="Arial" w:eastAsia="Arial" w:hAnsi="Arial"/>
                 <w:b/>
                 <w:bCs/>
                 <w:sz w:val="18"/>
@@ -1252,11 +1130,10 @@
             </w:r>
             <w:r>
               <w:rPr>
-                <w:rFonts w:ascii="Arial" w:cs="Arial" w:eastAsia="Arial" w:hAnsi="Arial"/>
-                <w:sz w:val="18"/>
-                <w:szCs w:val="18"/>
-              </w:rPr>
-              <w:t xml:space="preserve">Results are presented clearly with appropriate visualizations or tables. Interpretation is careful and does not overstate findings.</w:t>
+                <w:sz w:val="18"/>
+                <w:szCs w:val="18"/>
+              </w:rPr>
+              <w:t>Results are presented clearly with appropriate visualizations or tables. Interpretation is careful and does not overstate findings.</w:t>
             </w:r>
           </w:p>
           <w:p>
@@ -1265,7 +1142,6 @@
             </w:pPr>
             <w:r>
               <w:rPr>
-                <w:rFonts w:ascii="Arial" w:cs="Arial" w:eastAsia="Arial" w:hAnsi="Arial"/>
                 <w:b/>
                 <w:bCs/>
                 <w:sz w:val="18"/>
@@ -1275,11 +1151,10 @@
             </w:r>
             <w:r>
               <w:rPr>
-                <w:rFonts w:ascii="Arial" w:cs="Arial" w:eastAsia="Arial" w:hAnsi="Arial"/>
-                <w:sz w:val="18"/>
-                <w:szCs w:val="18"/>
-              </w:rPr>
-              <w:t xml:space="preserve">Results are present but presentation is unclear or interpretation stretches beyond what the evidence supports.</w:t>
+                <w:sz w:val="18"/>
+                <w:szCs w:val="18"/>
+              </w:rPr>
+              <w:t>Results are present but presentation is unclear or interpretation stretches beyond what the evidence supports.</w:t>
             </w:r>
           </w:p>
           <w:p>
@@ -1288,7 +1163,6 @@
             </w:pPr>
             <w:r>
               <w:rPr>
-                <w:rFonts w:ascii="Arial" w:cs="Arial" w:eastAsia="Arial" w:hAnsi="Arial"/>
                 <w:b/>
                 <w:bCs/>
                 <w:sz w:val="18"/>
@@ -1298,32 +1172,36 @@
             </w:r>
             <w:r>
               <w:rPr>
-                <w:rFonts w:ascii="Arial" w:cs="Arial" w:eastAsia="Arial" w:hAnsi="Arial"/>
-                <w:sz w:val="18"/>
-                <w:szCs w:val="18"/>
-              </w:rPr>
-              <w:t xml:space="preserve">Results are missing, poorly presented, or interpretation is disconnected from the analysis.</w:t>
+                <w:sz w:val="18"/>
+                <w:szCs w:val="18"/>
+              </w:rPr>
+              <w:t>Results are missing, poorly presented, or interpretation is disconnected from the analysis.</w:t>
             </w:r>
           </w:p>
         </w:tc>
       </w:tr>
       <w:tr>
+        <w:tblPrEx>
+          <w:tblCellMar>
+            <w:top w:w="0" w:type="dxa"/>
+            <w:bottom w:w="0" w:type="dxa"/>
+          </w:tblCellMar>
+        </w:tblPrEx>
         <w:tc>
           <w:tcPr>
-            <w:tcW w:type="dxa" w:w="2800"/>
+            <w:tcW w:w="2800" w:type="dxa"/>
             <w:tcBorders>
-              <w:top w:val="single" w:color="999999" w:sz="1"/>
-              <w:left w:val="single" w:color="999999" w:sz="1"/>
-              <w:bottom w:val="single" w:color="999999" w:sz="1"/>
-              <w:right w:val="single" w:color="999999" w:sz="1"/>
+              <w:top w:val="single" w:sz="1" w:space="0" w:color="999999"/>
+              <w:left w:val="single" w:sz="1" w:space="0" w:color="999999"/>
+              <w:bottom w:val="single" w:sz="1" w:space="0" w:color="999999"/>
+              <w:right w:val="single" w:sz="1" w:space="0" w:color="999999"/>
             </w:tcBorders>
             <w:tcMar>
-              <w:top w:type="dxa" w:w="80"/>
-              <w:left w:type="dxa" w:w="120"/>
-              <w:bottom w:type="dxa" w:w="80"/>
-              <w:right w:type="dxa" w:w="120"/>
+              <w:top w:w="80" w:type="dxa"/>
+              <w:left w:w="120" w:type="dxa"/>
+              <w:bottom w:w="80" w:type="dxa"/>
+              <w:right w:w="120" w:type="dxa"/>
             </w:tcMar>
-            <w:vAlign w:val="top"/>
           </w:tcPr>
           <w:p>
             <w:pPr>
@@ -1331,30 +1209,28 @@
             </w:pPr>
             <w:r>
               <w:rPr>
-                <w:rFonts w:ascii="Arial" w:cs="Arial" w:eastAsia="Arial" w:hAnsi="Arial"/>
                 <w:sz w:val="20"/>
                 <w:szCs w:val="20"/>
               </w:rPr>
-              <w:t xml:space="preserve">Validation &amp; Robustness</w:t>
+              <w:t>Validation &amp; Robustness</w:t>
             </w:r>
           </w:p>
         </w:tc>
         <w:tc>
           <w:tcPr>
-            <w:tcW w:type="dxa" w:w="800"/>
+            <w:tcW w:w="800" w:type="dxa"/>
             <w:tcBorders>
-              <w:top w:val="single" w:color="999999" w:sz="1"/>
-              <w:left w:val="single" w:color="999999" w:sz="1"/>
-              <w:bottom w:val="single" w:color="999999" w:sz="1"/>
-              <w:right w:val="single" w:color="999999" w:sz="1"/>
+              <w:top w:val="single" w:sz="1" w:space="0" w:color="999999"/>
+              <w:left w:val="single" w:sz="1" w:space="0" w:color="999999"/>
+              <w:bottom w:val="single" w:sz="1" w:space="0" w:color="999999"/>
+              <w:right w:val="single" w:sz="1" w:space="0" w:color="999999"/>
             </w:tcBorders>
             <w:tcMar>
-              <w:top w:type="dxa" w:w="80"/>
-              <w:left w:type="dxa" w:w="120"/>
-              <w:bottom w:type="dxa" w:w="80"/>
-              <w:right w:type="dxa" w:w="120"/>
+              <w:top w:w="80" w:type="dxa"/>
+              <w:left w:w="120" w:type="dxa"/>
+              <w:bottom w:w="80" w:type="dxa"/>
+              <w:right w:w="120" w:type="dxa"/>
             </w:tcMar>
-            <w:vAlign w:val="top"/>
           </w:tcPr>
           <w:p>
             <w:pPr>
@@ -1362,30 +1238,28 @@
             </w:pPr>
             <w:r>
               <w:rPr>
-                <w:rFonts w:ascii="Arial" w:cs="Arial" w:eastAsia="Arial" w:hAnsi="Arial"/>
                 <w:sz w:val="20"/>
                 <w:szCs w:val="20"/>
               </w:rPr>
-              <w:t xml:space="preserve">10</w:t>
+              <w:t>10</w:t>
             </w:r>
           </w:p>
         </w:tc>
         <w:tc>
           <w:tcPr>
-            <w:tcW w:type="dxa" w:w="5760"/>
+            <w:tcW w:w="5760" w:type="dxa"/>
             <w:tcBorders>
-              <w:top w:val="single" w:color="999999" w:sz="1"/>
-              <w:left w:val="single" w:color="999999" w:sz="1"/>
-              <w:bottom w:val="single" w:color="999999" w:sz="1"/>
-              <w:right w:val="single" w:color="999999" w:sz="1"/>
+              <w:top w:val="single" w:sz="1" w:space="0" w:color="999999"/>
+              <w:left w:val="single" w:sz="1" w:space="0" w:color="999999"/>
+              <w:bottom w:val="single" w:sz="1" w:space="0" w:color="999999"/>
+              <w:right w:val="single" w:sz="1" w:space="0" w:color="999999"/>
             </w:tcBorders>
             <w:tcMar>
-              <w:top w:type="dxa" w:w="80"/>
-              <w:left w:type="dxa" w:w="120"/>
-              <w:bottom w:type="dxa" w:w="80"/>
-              <w:right w:type="dxa" w:w="120"/>
+              <w:top w:w="80" w:type="dxa"/>
+              <w:left w:w="120" w:type="dxa"/>
+              <w:bottom w:w="80" w:type="dxa"/>
+              <w:right w:w="120" w:type="dxa"/>
             </w:tcMar>
-            <w:vAlign w:val="top"/>
           </w:tcPr>
           <w:p>
             <w:pPr>
@@ -1393,7 +1267,6 @@
             </w:pPr>
             <w:r>
               <w:rPr>
-                <w:rFonts w:ascii="Arial" w:cs="Arial" w:eastAsia="Arial" w:hAnsi="Arial"/>
                 <w:b/>
                 <w:bCs/>
                 <w:sz w:val="18"/>
@@ -1403,11 +1276,10 @@
             </w:r>
             <w:r>
               <w:rPr>
-                <w:rFonts w:ascii="Arial" w:cs="Arial" w:eastAsia="Arial" w:hAnsi="Arial"/>
-                <w:sz w:val="18"/>
-                <w:szCs w:val="18"/>
-              </w:rPr>
-              <w:t xml:space="preserve">At least two substantive checks (e.g., placebo tests, sensitivity analyses, alternative specifications). Limitations are tied to evidence.</w:t>
+                <w:sz w:val="18"/>
+                <w:szCs w:val="18"/>
+              </w:rPr>
+              <w:t>At least two substantive checks (e.g., placebo tests, sensitivity analyses, alternative specifications). Limitations are tied to evidence.</w:t>
             </w:r>
           </w:p>
           <w:p>
@@ -1416,7 +1288,6 @@
             </w:pPr>
             <w:r>
               <w:rPr>
-                <w:rFonts w:ascii="Arial" w:cs="Arial" w:eastAsia="Arial" w:hAnsi="Arial"/>
                 <w:b/>
                 <w:bCs/>
                 <w:sz w:val="18"/>
@@ -1426,11 +1297,10 @@
             </w:r>
             <w:r>
               <w:rPr>
-                <w:rFonts w:ascii="Arial" w:cs="Arial" w:eastAsia="Arial" w:hAnsi="Arial"/>
-                <w:sz w:val="18"/>
-                <w:szCs w:val="18"/>
-              </w:rPr>
-              <w:t xml:space="preserve">Some validation present but limited in scope or not clearly tied to the main findings.</w:t>
+                <w:sz w:val="18"/>
+                <w:szCs w:val="18"/>
+              </w:rPr>
+              <w:t>Some validation present but limited in scope or not clearly tied to the main findings.</w:t>
             </w:r>
           </w:p>
           <w:p>
@@ -1439,7 +1309,6 @@
             </w:pPr>
             <w:r>
               <w:rPr>
-                <w:rFonts w:ascii="Arial" w:cs="Arial" w:eastAsia="Arial" w:hAnsi="Arial"/>
                 <w:b/>
                 <w:bCs/>
                 <w:sz w:val="18"/>
@@ -1449,33 +1318,37 @@
             </w:r>
             <w:r>
               <w:rPr>
-                <w:rFonts w:ascii="Arial" w:cs="Arial" w:eastAsia="Arial" w:hAnsi="Arial"/>
-                <w:sz w:val="18"/>
-                <w:szCs w:val="18"/>
-              </w:rPr>
-              <w:t xml:space="preserve">No validation or robustness checks.</w:t>
+                <w:sz w:val="18"/>
+                <w:szCs w:val="18"/>
+              </w:rPr>
+              <w:t>No validation or robustness checks.</w:t>
             </w:r>
           </w:p>
         </w:tc>
       </w:tr>
       <w:tr>
+        <w:tblPrEx>
+          <w:tblCellMar>
+            <w:top w:w="0" w:type="dxa"/>
+            <w:bottom w:w="0" w:type="dxa"/>
+          </w:tblCellMar>
+        </w:tblPrEx>
         <w:tc>
           <w:tcPr>
-            <w:tcW w:type="dxa" w:w="2800"/>
+            <w:tcW w:w="2800" w:type="dxa"/>
             <w:tcBorders>
-              <w:top w:val="single" w:color="999999" w:sz="1"/>
-              <w:left w:val="single" w:color="999999" w:sz="1"/>
-              <w:bottom w:val="single" w:color="999999" w:sz="1"/>
-              <w:right w:val="single" w:color="999999" w:sz="1"/>
+              <w:top w:val="single" w:sz="1" w:space="0" w:color="999999"/>
+              <w:left w:val="single" w:sz="1" w:space="0" w:color="999999"/>
+              <w:bottom w:val="single" w:sz="1" w:space="0" w:color="999999"/>
+              <w:right w:val="single" w:sz="1" w:space="0" w:color="999999"/>
             </w:tcBorders>
-            <w:shd w:fill="F5F5F5" w:val="clear"/>
+            <w:shd w:val="clear" w:color="auto" w:fill="F5F5F5"/>
             <w:tcMar>
-              <w:top w:type="dxa" w:w="80"/>
-              <w:left w:type="dxa" w:w="120"/>
-              <w:bottom w:type="dxa" w:w="80"/>
-              <w:right w:type="dxa" w:w="120"/>
+              <w:top w:w="80" w:type="dxa"/>
+              <w:left w:w="120" w:type="dxa"/>
+              <w:bottom w:w="80" w:type="dxa"/>
+              <w:right w:w="120" w:type="dxa"/>
             </w:tcMar>
-            <w:vAlign w:val="top"/>
           </w:tcPr>
           <w:p>
             <w:pPr>
@@ -1483,31 +1356,29 @@
             </w:pPr>
             <w:r>
               <w:rPr>
-                <w:rFonts w:ascii="Arial" w:cs="Arial" w:eastAsia="Arial" w:hAnsi="Arial"/>
                 <w:sz w:val="20"/>
                 <w:szCs w:val="20"/>
               </w:rPr>
-              <w:t xml:space="preserve">Writing &amp; Organization</w:t>
+              <w:t>Writing &amp; Organization</w:t>
             </w:r>
           </w:p>
         </w:tc>
         <w:tc>
           <w:tcPr>
-            <w:tcW w:type="dxa" w:w="800"/>
+            <w:tcW w:w="800" w:type="dxa"/>
             <w:tcBorders>
-              <w:top w:val="single" w:color="999999" w:sz="1"/>
-              <w:left w:val="single" w:color="999999" w:sz="1"/>
-              <w:bottom w:val="single" w:color="999999" w:sz="1"/>
-              <w:right w:val="single" w:color="999999" w:sz="1"/>
+              <w:top w:val="single" w:sz="1" w:space="0" w:color="999999"/>
+              <w:left w:val="single" w:sz="1" w:space="0" w:color="999999"/>
+              <w:bottom w:val="single" w:sz="1" w:space="0" w:color="999999"/>
+              <w:right w:val="single" w:sz="1" w:space="0" w:color="999999"/>
             </w:tcBorders>
-            <w:shd w:fill="F5F5F5" w:val="clear"/>
+            <w:shd w:val="clear" w:color="auto" w:fill="F5F5F5"/>
             <w:tcMar>
-              <w:top w:type="dxa" w:w="80"/>
-              <w:left w:type="dxa" w:w="120"/>
-              <w:bottom w:type="dxa" w:w="80"/>
-              <w:right w:type="dxa" w:w="120"/>
+              <w:top w:w="80" w:type="dxa"/>
+              <w:left w:w="120" w:type="dxa"/>
+              <w:bottom w:w="80" w:type="dxa"/>
+              <w:right w:w="120" w:type="dxa"/>
             </w:tcMar>
-            <w:vAlign w:val="top"/>
           </w:tcPr>
           <w:p>
             <w:pPr>
@@ -1515,31 +1386,29 @@
             </w:pPr>
             <w:r>
               <w:rPr>
-                <w:rFonts w:ascii="Arial" w:cs="Arial" w:eastAsia="Arial" w:hAnsi="Arial"/>
                 <w:sz w:val="20"/>
                 <w:szCs w:val="20"/>
               </w:rPr>
-              <w:t xml:space="preserve">10</w:t>
+              <w:t>10</w:t>
             </w:r>
           </w:p>
         </w:tc>
         <w:tc>
           <w:tcPr>
-            <w:tcW w:type="dxa" w:w="5760"/>
+            <w:tcW w:w="5760" w:type="dxa"/>
             <w:tcBorders>
-              <w:top w:val="single" w:color="999999" w:sz="1"/>
-              <w:left w:val="single" w:color="999999" w:sz="1"/>
-              <w:bottom w:val="single" w:color="999999" w:sz="1"/>
-              <w:right w:val="single" w:color="999999" w:sz="1"/>
+              <w:top w:val="single" w:sz="1" w:space="0" w:color="999999"/>
+              <w:left w:val="single" w:sz="1" w:space="0" w:color="999999"/>
+              <w:bottom w:val="single" w:sz="1" w:space="0" w:color="999999"/>
+              <w:right w:val="single" w:sz="1" w:space="0" w:color="999999"/>
             </w:tcBorders>
-            <w:shd w:fill="F5F5F5" w:val="clear"/>
+            <w:shd w:val="clear" w:color="auto" w:fill="F5F5F5"/>
             <w:tcMar>
-              <w:top w:type="dxa" w:w="80"/>
-              <w:left w:type="dxa" w:w="120"/>
-              <w:bottom w:type="dxa" w:w="80"/>
-              <w:right w:type="dxa" w:w="120"/>
+              <w:top w:w="80" w:type="dxa"/>
+              <w:left w:w="120" w:type="dxa"/>
+              <w:bottom w:w="80" w:type="dxa"/>
+              <w:right w:w="120" w:type="dxa"/>
             </w:tcMar>
-            <w:vAlign w:val="top"/>
           </w:tcPr>
           <w:p>
             <w:pPr>
@@ -1547,7 +1416,6 @@
             </w:pPr>
             <w:r>
               <w:rPr>
-                <w:rFonts w:ascii="Arial" w:cs="Arial" w:eastAsia="Arial" w:hAnsi="Arial"/>
                 <w:b/>
                 <w:bCs/>
                 <w:sz w:val="18"/>
@@ -1557,11 +1425,10 @@
             </w:r>
             <w:r>
               <w:rPr>
-                <w:rFonts w:ascii="Arial" w:cs="Arial" w:eastAsia="Arial" w:hAnsi="Arial"/>
-                <w:sz w:val="18"/>
-                <w:szCs w:val="18"/>
-              </w:rPr>
-              <w:t xml:space="preserve">Clear, professional prose. Logical structure. Figures and tables are labeled and referenced in text.</w:t>
+                <w:sz w:val="18"/>
+                <w:szCs w:val="18"/>
+              </w:rPr>
+              <w:t>Clear, professional prose. Logical structure. Figures and tables are labeled and referenced in text.</w:t>
             </w:r>
           </w:p>
           <w:p>
@@ -1570,7 +1437,6 @@
             </w:pPr>
             <w:r>
               <w:rPr>
-                <w:rFonts w:ascii="Arial" w:cs="Arial" w:eastAsia="Arial" w:hAnsi="Arial"/>
                 <w:b/>
                 <w:bCs/>
                 <w:sz w:val="18"/>
@@ -1580,11 +1446,10 @@
             </w:r>
             <w:r>
               <w:rPr>
-                <w:rFonts w:ascii="Arial" w:cs="Arial" w:eastAsia="Arial" w:hAnsi="Arial"/>
-                <w:sz w:val="18"/>
-                <w:szCs w:val="18"/>
-              </w:rPr>
-              <w:t xml:space="preserve">Readable but uneven; some sections are unclear, redundant, or poorly organized.</w:t>
+                <w:sz w:val="18"/>
+                <w:szCs w:val="18"/>
+              </w:rPr>
+              <w:t>Readable but uneven; some sections are unclear, redundant, or poorly organized.</w:t>
             </w:r>
           </w:p>
           <w:p>
@@ -1593,7 +1458,6 @@
             </w:pPr>
             <w:r>
               <w:rPr>
-                <w:rFonts w:ascii="Arial" w:cs="Arial" w:eastAsia="Arial" w:hAnsi="Arial"/>
                 <w:b/>
                 <w:bCs/>
                 <w:sz w:val="18"/>
@@ -1603,32 +1467,36 @@
             </w:r>
             <w:r>
               <w:rPr>
-                <w:rFonts w:ascii="Arial" w:cs="Arial" w:eastAsia="Arial" w:hAnsi="Arial"/>
-                <w:sz w:val="18"/>
-                <w:szCs w:val="18"/>
-              </w:rPr>
-              <w:t xml:space="preserve">Difficult to follow; major structural or clarity problems.</w:t>
+                <w:sz w:val="18"/>
+                <w:szCs w:val="18"/>
+              </w:rPr>
+              <w:t>Difficult to follow; major structural or clarity problems.</w:t>
             </w:r>
           </w:p>
         </w:tc>
       </w:tr>
       <w:tr>
+        <w:tblPrEx>
+          <w:tblCellMar>
+            <w:top w:w="0" w:type="dxa"/>
+            <w:bottom w:w="0" w:type="dxa"/>
+          </w:tblCellMar>
+        </w:tblPrEx>
         <w:tc>
           <w:tcPr>
-            <w:tcW w:type="dxa" w:w="2800"/>
+            <w:tcW w:w="2800" w:type="dxa"/>
             <w:tcBorders>
-              <w:top w:val="single" w:color="999999" w:sz="1"/>
-              <w:left w:val="single" w:color="999999" w:sz="1"/>
-              <w:bottom w:val="single" w:color="999999" w:sz="1"/>
-              <w:right w:val="single" w:color="999999" w:sz="1"/>
+              <w:top w:val="single" w:sz="1" w:space="0" w:color="999999"/>
+              <w:left w:val="single" w:sz="1" w:space="0" w:color="999999"/>
+              <w:bottom w:val="single" w:sz="1" w:space="0" w:color="999999"/>
+              <w:right w:val="single" w:sz="1" w:space="0" w:color="999999"/>
             </w:tcBorders>
             <w:tcMar>
-              <w:top w:type="dxa" w:w="80"/>
-              <w:left w:type="dxa" w:w="120"/>
-              <w:bottom w:type="dxa" w:w="80"/>
-              <w:right w:type="dxa" w:w="120"/>
+              <w:top w:w="80" w:type="dxa"/>
+              <w:left w:w="120" w:type="dxa"/>
+              <w:bottom w:w="80" w:type="dxa"/>
+              <w:right w:w="120" w:type="dxa"/>
             </w:tcMar>
-            <w:vAlign w:val="top"/>
           </w:tcPr>
           <w:p>
             <w:pPr>
@@ -1636,30 +1504,29 @@
             </w:pPr>
             <w:r>
               <w:rPr>
-                <w:rFonts w:ascii="Arial" w:cs="Arial" w:eastAsia="Arial" w:hAnsi="Arial"/>
                 <w:sz w:val="20"/>
                 <w:szCs w:val="20"/>
               </w:rPr>
-              <w:t xml:space="preserve">Reproducibility</w:t>
+              <w:lastRenderedPageBreak/>
+              <w:t>Reproducibility</w:t>
             </w:r>
           </w:p>
         </w:tc>
         <w:tc>
           <w:tcPr>
-            <w:tcW w:type="dxa" w:w="800"/>
+            <w:tcW w:w="800" w:type="dxa"/>
             <w:tcBorders>
-              <w:top w:val="single" w:color="999999" w:sz="1"/>
-              <w:left w:val="single" w:color="999999" w:sz="1"/>
-              <w:bottom w:val="single" w:color="999999" w:sz="1"/>
-              <w:right w:val="single" w:color="999999" w:sz="1"/>
+              <w:top w:val="single" w:sz="1" w:space="0" w:color="999999"/>
+              <w:left w:val="single" w:sz="1" w:space="0" w:color="999999"/>
+              <w:bottom w:val="single" w:sz="1" w:space="0" w:color="999999"/>
+              <w:right w:val="single" w:sz="1" w:space="0" w:color="999999"/>
             </w:tcBorders>
             <w:tcMar>
-              <w:top w:type="dxa" w:w="80"/>
-              <w:left w:type="dxa" w:w="120"/>
-              <w:bottom w:type="dxa" w:w="80"/>
-              <w:right w:type="dxa" w:w="120"/>
+              <w:top w:w="80" w:type="dxa"/>
+              <w:left w:w="120" w:type="dxa"/>
+              <w:bottom w:w="80" w:type="dxa"/>
+              <w:right w:w="120" w:type="dxa"/>
             </w:tcMar>
-            <w:vAlign w:val="top"/>
           </w:tcPr>
           <w:p>
             <w:pPr>
@@ -1667,30 +1534,28 @@
             </w:pPr>
             <w:r>
               <w:rPr>
-                <w:rFonts w:ascii="Arial" w:cs="Arial" w:eastAsia="Arial" w:hAnsi="Arial"/>
                 <w:sz w:val="20"/>
                 <w:szCs w:val="20"/>
               </w:rPr>
-              <w:t xml:space="preserve">5</w:t>
+              <w:t>5</w:t>
             </w:r>
           </w:p>
         </w:tc>
         <w:tc>
           <w:tcPr>
-            <w:tcW w:type="dxa" w:w="5760"/>
+            <w:tcW w:w="5760" w:type="dxa"/>
             <w:tcBorders>
-              <w:top w:val="single" w:color="999999" w:sz="1"/>
-              <w:left w:val="single" w:color="999999" w:sz="1"/>
-              <w:bottom w:val="single" w:color="999999" w:sz="1"/>
-              <w:right w:val="single" w:color="999999" w:sz="1"/>
+              <w:top w:val="single" w:sz="1" w:space="0" w:color="999999"/>
+              <w:left w:val="single" w:sz="1" w:space="0" w:color="999999"/>
+              <w:bottom w:val="single" w:sz="1" w:space="0" w:color="999999"/>
+              <w:right w:val="single" w:sz="1" w:space="0" w:color="999999"/>
             </w:tcBorders>
             <w:tcMar>
-              <w:top w:type="dxa" w:w="80"/>
-              <w:left w:type="dxa" w:w="120"/>
-              <w:bottom w:type="dxa" w:w="80"/>
-              <w:right w:type="dxa" w:w="120"/>
+              <w:top w:w="80" w:type="dxa"/>
+              <w:left w:w="120" w:type="dxa"/>
+              <w:bottom w:w="80" w:type="dxa"/>
+              <w:right w:w="120" w:type="dxa"/>
             </w:tcMar>
-            <w:vAlign w:val="top"/>
           </w:tcPr>
           <w:p>
             <w:pPr>
@@ -1698,7 +1563,6 @@
             </w:pPr>
             <w:r>
               <w:rPr>
-                <w:rFonts w:ascii="Arial" w:cs="Arial" w:eastAsia="Arial" w:hAnsi="Arial"/>
                 <w:b/>
                 <w:bCs/>
                 <w:sz w:val="18"/>
@@ -1708,11 +1572,10 @@
             </w:r>
             <w:r>
               <w:rPr>
-                <w:rFonts w:ascii="Arial" w:cs="Arial" w:eastAsia="Arial" w:hAnsi="Arial"/>
-                <w:sz w:val="18"/>
-                <w:szCs w:val="18"/>
-              </w:rPr>
-              <w:t xml:space="preserve">Code and data (or clear access instructions) are provided. A reader could reproduce the main results.</w:t>
+                <w:sz w:val="18"/>
+                <w:szCs w:val="18"/>
+              </w:rPr>
+              <w:t>Code and data (or clear access instructions) are provided. A reader could reproduce the main results.</w:t>
             </w:r>
           </w:p>
           <w:p>
@@ -1721,7 +1584,6 @@
             </w:pPr>
             <w:r>
               <w:rPr>
-                <w:rFonts w:ascii="Arial" w:cs="Arial" w:eastAsia="Arial" w:hAnsi="Arial"/>
                 <w:b/>
                 <w:bCs/>
                 <w:sz w:val="18"/>
@@ -1731,11 +1593,10 @@
             </w:r>
             <w:r>
               <w:rPr>
-                <w:rFonts w:ascii="Arial" w:cs="Arial" w:eastAsia="Arial" w:hAnsi="Arial"/>
-                <w:sz w:val="18"/>
-                <w:szCs w:val="18"/>
-              </w:rPr>
-              <w:t xml:space="preserve">Some code/data provided but reproduction would require significant effort or guesswork.</w:t>
+                <w:sz w:val="18"/>
+                <w:szCs w:val="18"/>
+              </w:rPr>
+              <w:t>Some code/data provided but reproduction would require significant effort or guesswork.</w:t>
             </w:r>
           </w:p>
           <w:p>
@@ -1744,7 +1605,6 @@
             </w:pPr>
             <w:r>
               <w:rPr>
-                <w:rFonts w:ascii="Arial" w:cs="Arial" w:eastAsia="Arial" w:hAnsi="Arial"/>
                 <w:b/>
                 <w:bCs/>
                 <w:sz w:val="18"/>
@@ -1754,11 +1614,10 @@
             </w:r>
             <w:r>
               <w:rPr>
-                <w:rFonts w:ascii="Arial" w:cs="Arial" w:eastAsia="Arial" w:hAnsi="Arial"/>
-                <w:sz w:val="18"/>
-                <w:szCs w:val="18"/>
-              </w:rPr>
-              <w:t xml:space="preserve">No code or data provided; results cannot be reproduced.</w:t>
+                <w:sz w:val="18"/>
+                <w:szCs w:val="18"/>
+              </w:rPr>
+              <w:t>No code or data provided; results cannot be reproduced.</w:t>
             </w:r>
           </w:p>
         </w:tc>
@@ -1771,13 +1630,12 @@
       </w:pPr>
       <w:r>
         <w:rPr>
-          <w:rFonts w:ascii="Arial" w:cs="Arial" w:eastAsia="Arial" w:hAnsi="Arial"/>
           <w:b/>
           <w:bCs/>
           <w:sz w:val="24"/>
           <w:szCs w:val="24"/>
         </w:rPr>
-        <w:t xml:space="preserve">Total: 100 points</w:t>
+        <w:t>Total: 100 points</w:t>
       </w:r>
     </w:p>
     <w:p>
@@ -1785,7 +1643,7 @@
         <w:pStyle w:val="Heading1"/>
       </w:pPr>
       <w:r>
-        <w:t xml:space="preserve">A Note on Publishability</w:t>
+        <w:t>A Note on Publishability</w:t>
       </w:r>
     </w:p>
     <w:p>
@@ -1793,70 +1651,80 @@
         <w:spacing w:after="200"/>
       </w:pPr>
       <w:r>
-        <w:rPr>
-          <w:rFonts w:ascii="Arial" w:cs="Arial" w:eastAsia="Arial" w:hAnsi="Arial"/>
-          <w:sz w:val="22"/>
-          <w:szCs w:val="22"/>
-        </w:rPr>
-        <w:t xml:space="preserve">A paper that scores well on this rubric will be one that a reviewer at a general social science or computational methods venue would take seriously. That does not mean the paper must solve a major open problem or use the most complex method available. It means the question is well-posed, the execution is careful, the limitations are acknowledged, and the writing respects the reader’s time. Strong papers often do simple things well rather than complex things poorly.</w:t>
+        <w:t>A paper that scores well on this rubric will be one that a reviewer at a general social science or computational methods venue would take seriously. That does not mean the paper must solve a major open problem or use the most complex method available. It means the question is well-posed, the execution is careful, the limitations are acknowledged, and the writing respects the reader’s time. Strong papers often do simple things well rather than complex things poorly.</w:t>
       </w:r>
     </w:p>
     <w:sectPr>
-      <w:pgSz w:w="12240" w:h="15840" w:orient="portrait"/>
+      <w:pgSz w:w="12240" w:h="15840"/>
       <w:pgMar w:top="1440" w:right="1440" w:bottom="1440" w:left="1440" w:header="708" w:footer="708" w:gutter="0"/>
-      <w:pgNumType/>
+      <w:cols w:space="720"/>
       <w:docGrid w:linePitch="360"/>
     </w:sectPr>
   </w:body>
 </w:document>
 </file>
 
-<file path=word/comments.xml><?xml version="1.0" encoding="utf-8"?>
-<w:comments xmlns:cx="http://schemas.microsoft.com/office/drawing/2014/chartex" xmlns:cx1="http://schemas.microsoft.com/office/drawing/2015/9/8/chartex" xmlns:cx2="http://schemas.microsoft.com/office/drawing/2015/10/21/chartex" xmlns:cx3="http://schemas.microsoft.com/office/drawing/2016/5/9/chartex" xmlns:cx4="http://schemas.microsoft.com/office/drawing/2016/5/10/chartex" xmlns:cx5="http://schemas.microsoft.com/office/drawing/2016/5/11/chartex" xmlns:cx6="http://schemas.microsoft.com/office/drawing/2016/5/12/chartex" xmlns:cx7="http://schemas.microsoft.com/office/drawing/2016/5/13/chartex" xmlns:cx8="http://schemas.microsoft.com/office/drawing/2016/5/14/chartex" xmlns:mc="http://schemas.openxmlformats.org/markup-compatibility/2006" xmlns:aink="http://schemas.microsoft.com/office/drawing/2016/ink" xmlns:am3d="http://schemas.microsoft.com/office/drawing/2017/model3d" xmlns:o="urn:schemas-microsoft-com:office:office" xmlns:r="http://schemas.openxmlformats.org/officeDocument/2006/relationships" xmlns:m="http://schemas.openxmlformats.org/officeDocument/2006/math" xmlns:v="urn:schemas-microsoft-com:vml" xmlns:wp14="http://schemas.microsoft.com/office/word/2010/wordprocessingDrawing" xmlns:wp="http://schemas.openxmlformats.org/drawingml/2006/wordprocessingDrawing" xmlns:w10="urn:schemas-microsoft-com:office:word" xmlns:w="http://schemas.openxmlformats.org/wordprocessingml/2006/main" xmlns:w14="http://schemas.microsoft.com/office/word/2010/wordml" xmlns:w15="http://schemas.microsoft.com/office/word/2012/wordml" xmlns:w16cex="http://schemas.microsoft.com/office/word/2018/wordml/cex" xmlns:w16cid="http://schemas.microsoft.com/office/word/2016/wordml/cid" xmlns:w16="http://schemas.microsoft.com/office/word/2018/wordml" xmlns:w16sdtdh="http://schemas.microsoft.com/office/word/2020/wordml/sdtdatahash" xmlns:w16se="http://schemas.microsoft.com/office/word/2015/wordml/symex" xmlns:wpg="http://schemas.microsoft.com/office/word/2010/wordprocessingGroup" xmlns:wpi="http://schemas.microsoft.com/office/word/2010/wordprocessingInk" xmlns:wne="http://schemas.microsoft.com/office/word/2006/wordml" xmlns:wps="http://schemas.microsoft.com/office/word/2010/wordprocessingShape"/>
-</file>
-
-<file path=word/footnotes.xml><?xml version="1.0" encoding="utf-8"?>
-<w:footnotes xmlns:wpc="http://schemas.microsoft.com/office/word/2010/wordprocessingCanvas" xmlns:mc="http://schemas.openxmlformats.org/markup-compatibility/2006" xmlns:o="urn:schemas-microsoft-com:office:office" xmlns:r="http://schemas.openxmlformats.org/officeDocument/2006/relationships" xmlns:m="http://schemas.openxmlformats.org/officeDocument/2006/math" xmlns:v="urn:schemas-microsoft-com:vml" xmlns:wp14="http://schemas.microsoft.com/office/word/2010/wordprocessingDrawing" xmlns:wp="http://schemas.openxmlformats.org/drawingml/2006/wordprocessingDrawing" xmlns:w10="urn:schemas-microsoft-com:office:word" xmlns:w="http://schemas.openxmlformats.org/wordprocessingml/2006/main" xmlns:w14="http://schemas.microsoft.com/office/word/2010/wordml" xmlns:w15="http://schemas.microsoft.com/office/word/2012/wordml" xmlns:wpg="http://schemas.microsoft.com/office/word/2010/wordprocessingGroup" xmlns:wpi="http://schemas.microsoft.com/office/word/2010/wordprocessingInk" xmlns:wne="http://schemas.microsoft.com/office/word/2006/wordml" xmlns:wps="http://schemas.microsoft.com/office/word/2010/wordprocessingShape" mc:Ignorable="w14 w15 wp14">
-  <w:footnote w:type="separator" w:id="-1">
-    <w:p>
-      <w:pPr>
-        <w:spacing w:after="0" w:line="240" w:lineRule="auto"/>
-      </w:pPr>
-      <w:r>
-        <w:rPr>
-          <w:rStyle w:val="FootnoteReference"/>
-        </w:rPr>
-        <w:footnoteRef/>
-      </w:r>
-      <w:r>
-        <w:separator/>
-      </w:r>
-    </w:p>
-  </w:footnote>
-  <w:footnote w:type="continuationSeparator" w:id="0">
-    <w:p>
-      <w:pPr>
-        <w:spacing w:after="0" w:line="240" w:lineRule="auto"/>
-      </w:pPr>
-      <w:r>
-        <w:rPr>
-          <w:rStyle w:val="FootnoteReference"/>
-        </w:rPr>
-        <w:footnoteRef/>
-      </w:r>
-      <w:r>
-        <w:continuationSeparator/>
-      </w:r>
-    </w:p>
-  </w:footnote>
-</w:footnotes>
-</file>
-
 <file path=word/numbering.xml><?xml version="1.0" encoding="utf-8"?>
-<w:numbering xmlns:wpc="http://schemas.microsoft.com/office/word/2010/wordprocessingCanvas" xmlns:mc="http://schemas.openxmlformats.org/markup-compatibility/2006" xmlns:o="urn:schemas-microsoft-com:office:office" xmlns:r="http://schemas.openxmlformats.org/officeDocument/2006/relationships" xmlns:m="http://schemas.openxmlformats.org/officeDocument/2006/math" xmlns:v="urn:schemas-microsoft-com:vml" xmlns:wp14="http://schemas.microsoft.com/office/word/2010/wordprocessingDrawing" xmlns:wp="http://schemas.openxmlformats.org/drawingml/2006/wordprocessingDrawing" xmlns:w10="urn:schemas-microsoft-com:office:word" xmlns:w="http://schemas.openxmlformats.org/wordprocessingml/2006/main" xmlns:w14="http://schemas.microsoft.com/office/word/2010/wordml" xmlns:w15="http://schemas.microsoft.com/office/word/2012/wordml" xmlns:wpg="http://schemas.microsoft.com/office/word/2010/wordprocessingGroup" xmlns:wpi="http://schemas.microsoft.com/office/word/2010/wordprocessingInk" xmlns:wne="http://schemas.microsoft.com/office/word/2006/wordml" xmlns:wps="http://schemas.microsoft.com/office/word/2010/wordprocessingShape" mc:Ignorable="w14 w15 wp14">
+<w:numbering xmlns:wpc="http://schemas.microsoft.com/office/word/2010/wordprocessingCanvas" xmlns:cx="http://schemas.microsoft.com/office/drawing/2014/chartex" xmlns:cx1="http://schemas.microsoft.com/office/drawing/2015/9/8/chartex" xmlns:cx2="http://schemas.microsoft.com/office/drawing/2015/10/21/chartex" xmlns:cx3="http://schemas.microsoft.com/office/drawing/2016/5/9/chartex" xmlns:cx4="http://schemas.microsoft.com/office/drawing/2016/5/10/chartex" xmlns:cx5="http://schemas.microsoft.com/office/drawing/2016/5/11/chartex" xmlns:cx6="http://schemas.microsoft.com/office/drawing/2016/5/12/chartex" xmlns:cx7="http://schemas.microsoft.com/office/drawing/2016/5/13/chartex" xmlns:cx8="http://schemas.microsoft.com/office/drawing/2016/5/14/chartex" xmlns:mc="http://schemas.openxmlformats.org/markup-compatibility/2006" xmlns:aink="http://schemas.microsoft.com/office/drawing/2016/ink" xmlns:am3d="http://schemas.microsoft.com/office/drawing/2017/model3d" xmlns:o="urn:schemas-microsoft-com:office:office" xmlns:oel="http://schemas.microsoft.com/office/2019/extlst" xmlns:r="http://schemas.openxmlformats.org/officeDocument/2006/relationships" xmlns:m="http://schemas.openxmlformats.org/officeDocument/2006/math" xmlns:v="urn:schemas-microsoft-com:vml" xmlns:wp14="http://schemas.microsoft.com/office/word/2010/wordprocessingDrawing" xmlns:wp="http://schemas.openxmlformats.org/drawingml/2006/wordprocessingDrawing" xmlns:w10="urn:schemas-microsoft-com:office:word" xmlns:w="http://schemas.openxmlformats.org/wordprocessingml/2006/main" xmlns:w14="http://schemas.microsoft.com/office/word/2010/wordml" xmlns:w15="http://schemas.microsoft.com/office/word/2012/wordml" xmlns:w16cex="http://schemas.microsoft.com/office/word/2018/wordml/cex" xmlns:w16cid="http://schemas.microsoft.com/office/word/2016/wordml/cid" xmlns:w16="http://schemas.microsoft.com/office/word/2018/wordml" xmlns:w16du="http://schemas.microsoft.com/office/word/2023/wordml/word16du" xmlns:w16sdtdh="http://schemas.microsoft.com/office/word/2020/wordml/sdtdatahash" xmlns:w16sdtfl="http://schemas.microsoft.com/office/word/2024/wordml/sdtformatlock" xmlns:w16se="http://schemas.microsoft.com/office/word/2015/wordml/symex" xmlns:wpg="http://schemas.microsoft.com/office/word/2010/wordprocessingGroup" xmlns:wpi="http://schemas.microsoft.com/office/word/2010/wordprocessingInk" xmlns:wne="http://schemas.microsoft.com/office/word/2006/wordml" xmlns:wps="http://schemas.microsoft.com/office/word/2010/wordprocessingShape" mc:Ignorable="w14 w15 w16se w16cid w16 w16cex w16sdtdh w16sdtfl w16du wp14">
+  <w:abstractNum w:abstractNumId="0" w15:restartNumberingAfterBreak="0">
+    <w:nsid w:val="2AF83404"/>
+    <w:multiLevelType w:val="hybridMultilevel"/>
+    <w:tmpl w:val="65C46FF2"/>
+    <w:lvl w:ilvl="0" w:tplc="08D63686">
+      <w:start w:val="1"/>
+      <w:numFmt w:val="bullet"/>
+      <w:lvlText w:val="•"/>
+      <w:lvlJc w:val="left"/>
+      <w:pPr>
+        <w:ind w:left="720" w:hanging="360"/>
+      </w:pPr>
+    </w:lvl>
+    <w:lvl w:ilvl="1" w:tplc="36C2FA58">
+      <w:numFmt w:val="decimal"/>
+      <w:lvlText w:val=""/>
+      <w:lvlJc w:val="left"/>
+    </w:lvl>
+    <w:lvl w:ilvl="2" w:tplc="98A47860">
+      <w:numFmt w:val="decimal"/>
+      <w:lvlText w:val=""/>
+      <w:lvlJc w:val="left"/>
+    </w:lvl>
+    <w:lvl w:ilvl="3" w:tplc="772AE1B8">
+      <w:numFmt w:val="decimal"/>
+      <w:lvlText w:val=""/>
+      <w:lvlJc w:val="left"/>
+    </w:lvl>
+    <w:lvl w:ilvl="4" w:tplc="FD44C080">
+      <w:numFmt w:val="decimal"/>
+      <w:lvlText w:val=""/>
+      <w:lvlJc w:val="left"/>
+    </w:lvl>
+    <w:lvl w:ilvl="5" w:tplc="63FC26B8">
+      <w:numFmt w:val="decimal"/>
+      <w:lvlText w:val=""/>
+      <w:lvlJc w:val="left"/>
+    </w:lvl>
+    <w:lvl w:ilvl="6" w:tplc="DBB68438">
+      <w:numFmt w:val="decimal"/>
+      <w:lvlText w:val=""/>
+      <w:lvlJc w:val="left"/>
+    </w:lvl>
+    <w:lvl w:ilvl="7" w:tplc="D5CA5C66">
+      <w:numFmt w:val="decimal"/>
+      <w:lvlText w:val=""/>
+      <w:lvlJc w:val="left"/>
+    </w:lvl>
+    <w:lvl w:ilvl="8" w:tplc="33BC2D3E">
+      <w:numFmt w:val="decimal"/>
+      <w:lvlText w:val=""/>
+      <w:lvlJc w:val="left"/>
+    </w:lvl>
+  </w:abstractNum>
   <w:abstractNum w:abstractNumId="1" w15:restartNumberingAfterBreak="0">
+    <w:nsid w:val="4FC62FB4"/>
     <w:multiLevelType w:val="hybridMultilevel"/>
-    <w:lvl w:ilvl="0" w15:tentative="1">
+    <w:tmpl w:val="7DF23E58"/>
+    <w:lvl w:ilvl="0" w:tplc="3BAA66BE">
       <w:start w:val="1"/>
       <w:numFmt w:val="bullet"/>
       <w:lvlText w:val="●"/>
@@ -1865,7 +1733,7 @@
         <w:ind w:left="720" w:hanging="360"/>
       </w:pPr>
     </w:lvl>
-    <w:lvl w:ilvl="1" w15:tentative="1">
+    <w:lvl w:ilvl="1" w:tplc="17B01300">
       <w:start w:val="1"/>
       <w:numFmt w:val="bullet"/>
       <w:lvlText w:val="○"/>
@@ -1874,7 +1742,7 @@
         <w:ind w:left="1440" w:hanging="360"/>
       </w:pPr>
     </w:lvl>
-    <w:lvl w:ilvl="2" w15:tentative="1">
+    <w:lvl w:ilvl="2" w:tplc="426695B4">
       <w:start w:val="1"/>
       <w:numFmt w:val="bullet"/>
       <w:lvlText w:val="■"/>
@@ -1883,7 +1751,7 @@
         <w:ind w:left="2160" w:hanging="360"/>
       </w:pPr>
     </w:lvl>
-    <w:lvl w:ilvl="3" w15:tentative="1">
+    <w:lvl w:ilvl="3" w:tplc="AC164BFE">
       <w:start w:val="1"/>
       <w:numFmt w:val="bullet"/>
       <w:lvlText w:val="●"/>
@@ -1892,7 +1760,7 @@
         <w:ind w:left="2880" w:hanging="360"/>
       </w:pPr>
     </w:lvl>
-    <w:lvl w:ilvl="4" w15:tentative="1">
+    <w:lvl w:ilvl="4" w:tplc="DED8BD0C">
       <w:start w:val="1"/>
       <w:numFmt w:val="bullet"/>
       <w:lvlText w:val="○"/>
@@ -1901,7 +1769,7 @@
         <w:ind w:left="3600" w:hanging="360"/>
       </w:pPr>
     </w:lvl>
-    <w:lvl w:ilvl="5" w15:tentative="1">
+    <w:lvl w:ilvl="5" w:tplc="07DA8DD0">
       <w:start w:val="1"/>
       <w:numFmt w:val="bullet"/>
       <w:lvlText w:val="■"/>
@@ -1910,7 +1778,7 @@
         <w:ind w:left="4320" w:hanging="360"/>
       </w:pPr>
     </w:lvl>
-    <w:lvl w:ilvl="6" w15:tentative="1">
+    <w:lvl w:ilvl="6" w:tplc="0CD6C27E">
       <w:start w:val="1"/>
       <w:numFmt w:val="bullet"/>
       <w:lvlText w:val="●"/>
@@ -1919,7 +1787,7 @@
         <w:ind w:left="5040" w:hanging="360"/>
       </w:pPr>
     </w:lvl>
-    <w:lvl w:ilvl="7" w15:tentative="1">
+    <w:lvl w:ilvl="7" w:tplc="F0101BA6">
       <w:start w:val="1"/>
       <w:numFmt w:val="bullet"/>
       <w:lvlText w:val="●"/>
@@ -1928,7 +1796,7 @@
         <w:ind w:left="5760" w:hanging="360"/>
       </w:pPr>
     </w:lvl>
-    <w:lvl w:ilvl="8" w15:tentative="1">
+    <w:lvl w:ilvl="8" w:tplc="2FCACC56">
       <w:start w:val="1"/>
       <w:numFmt w:val="bullet"/>
       <w:lvlText w:val="●"/>
@@ -1939,20 +1807,10 @@
     </w:lvl>
   </w:abstractNum>
   <w:abstractNum w:abstractNumId="2" w15:restartNumberingAfterBreak="0">
+    <w:nsid w:val="6215057D"/>
     <w:multiLevelType w:val="hybridMultilevel"/>
-    <w:lvl w:ilvl="0" w15:tentative="1">
-      <w:start w:val="1"/>
-      <w:numFmt w:val="bullet"/>
-      <w:lvlText w:val="•"/>
-      <w:lvlJc w:val="left"/>
-      <w:pPr>
-        <w:ind w:left="720" w:hanging="360"/>
-      </w:pPr>
-    </w:lvl>
-  </w:abstractNum>
-  <w:abstractNum w:abstractNumId="3" w15:restartNumberingAfterBreak="0">
-    <w:multiLevelType w:val="hybridMultilevel"/>
-    <w:lvl w:ilvl="0" w15:tentative="1">
+    <w:tmpl w:val="66B0CBF8"/>
+    <w:lvl w:ilvl="0" w:tplc="6AE6671A">
       <w:start w:val="1"/>
       <w:numFmt w:val="decimal"/>
       <w:lvlText w:val="%1."/>
@@ -1961,21 +1819,61 @@
         <w:ind w:left="720" w:hanging="360"/>
       </w:pPr>
     </w:lvl>
+    <w:lvl w:ilvl="1" w:tplc="D10689AC">
+      <w:numFmt w:val="decimal"/>
+      <w:lvlText w:val=""/>
+      <w:lvlJc w:val="left"/>
+    </w:lvl>
+    <w:lvl w:ilvl="2" w:tplc="13004EEA">
+      <w:numFmt w:val="decimal"/>
+      <w:lvlText w:val=""/>
+      <w:lvlJc w:val="left"/>
+    </w:lvl>
+    <w:lvl w:ilvl="3" w:tplc="E1C4D856">
+      <w:numFmt w:val="decimal"/>
+      <w:lvlText w:val=""/>
+      <w:lvlJc w:val="left"/>
+    </w:lvl>
+    <w:lvl w:ilvl="4" w:tplc="F522C7B0">
+      <w:numFmt w:val="decimal"/>
+      <w:lvlText w:val=""/>
+      <w:lvlJc w:val="left"/>
+    </w:lvl>
+    <w:lvl w:ilvl="5" w:tplc="427CE03C">
+      <w:numFmt w:val="decimal"/>
+      <w:lvlText w:val=""/>
+      <w:lvlJc w:val="left"/>
+    </w:lvl>
+    <w:lvl w:ilvl="6" w:tplc="ED2EB680">
+      <w:numFmt w:val="decimal"/>
+      <w:lvlText w:val=""/>
+      <w:lvlJc w:val="left"/>
+    </w:lvl>
+    <w:lvl w:ilvl="7" w:tplc="E264D356">
+      <w:numFmt w:val="decimal"/>
+      <w:lvlText w:val=""/>
+      <w:lvlJc w:val="left"/>
+    </w:lvl>
+    <w:lvl w:ilvl="8" w:tplc="2BB4FB68">
+      <w:numFmt w:val="decimal"/>
+      <w:lvlText w:val=""/>
+      <w:lvlJc w:val="left"/>
+    </w:lvl>
   </w:abstractNum>
-  <w:num w:numId="1">
+  <w:num w:numId="1" w16cid:durableId="1272010415">
     <w:abstractNumId w:val="1"/>
     <w:lvlOverride w:ilvl="0">
       <w:startOverride w:val="1"/>
     </w:lvlOverride>
   </w:num>
-  <w:num w:numId="2">
-    <w:abstractNumId w:val="3"/>
+  <w:num w:numId="2" w16cid:durableId="2003511076">
+    <w:abstractNumId w:val="2"/>
     <w:lvlOverride w:ilvl="0">
       <w:startOverride w:val="1"/>
     </w:lvlOverride>
   </w:num>
-  <w:num w:numId="3">
-    <w:abstractNumId w:val="2"/>
+  <w:num w:numId="3" w16cid:durableId="837117963">
+    <w:abstractNumId w:val="0"/>
     <w:lvlOverride w:ilvl="0">
       <w:startOverride w:val="1"/>
     </w:lvlOverride>
@@ -1984,54 +1882,443 @@
 </file>
 
 <file path=word/styles.xml><?xml version="1.0" encoding="utf-8"?>
-<w:styles xmlns:mc="http://schemas.openxmlformats.org/markup-compatibility/2006" xmlns:r="http://schemas.openxmlformats.org/officeDocument/2006/relationships" xmlns:w="http://schemas.openxmlformats.org/wordprocessingml/2006/main" xmlns:w14="http://schemas.microsoft.com/office/word/2010/wordml" xmlns:w15="http://schemas.microsoft.com/office/word/2012/wordml" mc:Ignorable="w14 w15">
+<w:styles xmlns:mc="http://schemas.openxmlformats.org/markup-compatibility/2006" xmlns:r="http://schemas.openxmlformats.org/officeDocument/2006/relationships" xmlns:w="http://schemas.openxmlformats.org/wordprocessingml/2006/main" xmlns:w14="http://schemas.microsoft.com/office/word/2010/wordml" xmlns:w15="http://schemas.microsoft.com/office/word/2012/wordml" xmlns:w16cex="http://schemas.microsoft.com/office/word/2018/wordml/cex" xmlns:w16cid="http://schemas.microsoft.com/office/word/2016/wordml/cid" xmlns:w16="http://schemas.microsoft.com/office/word/2018/wordml" xmlns:w16du="http://schemas.microsoft.com/office/word/2023/wordml/word16du" xmlns:w16sdtdh="http://schemas.microsoft.com/office/word/2020/wordml/sdtdatahash" xmlns:w16sdtfl="http://schemas.microsoft.com/office/word/2024/wordml/sdtformatlock" xmlns:w16se="http://schemas.microsoft.com/office/word/2015/wordml/symex" mc:Ignorable="w14 w15 w16se w16cid w16 w16cex w16sdtdh w16sdtfl w16du">
   <w:docDefaults>
     <w:rPrDefault>
       <w:rPr>
-        <w:rFonts w:ascii="Arial" w:cs="Arial" w:eastAsia="Arial" w:hAnsi="Arial"/>
+        <w:rFonts w:ascii="Arial" w:eastAsia="Arial" w:hAnsi="Arial" w:cs="Arial"/>
         <w:sz w:val="22"/>
         <w:szCs w:val="22"/>
+        <w:lang w:val="en-US" w:eastAsia="en-US" w:bidi="ar-SA"/>
       </w:rPr>
     </w:rPrDefault>
     <w:pPrDefault/>
   </w:docDefaults>
-  <w:style w:type="paragraph" w:styleId="Title">
-    <w:name w:val="Title"/>
-    <w:basedOn w:val="Normal"/>
-    <w:next w:val="Normal"/>
+  <w:latentStyles w:defLockedState="0" w:defUIPriority="99" w:defSemiHidden="0" w:defUnhideWhenUsed="0" w:defQFormat="0" w:count="376">
+    <w:lsdException w:name="Normal" w:uiPriority="0" w:qFormat="1"/>
+    <w:lsdException w:name="heading 1" w:uiPriority="9" w:qFormat="1"/>
+    <w:lsdException w:name="heading 2" w:semiHidden="1" w:uiPriority="9" w:unhideWhenUsed="1" w:qFormat="1"/>
+    <w:lsdException w:name="heading 3" w:semiHidden="1" w:uiPriority="9" w:unhideWhenUsed="1" w:qFormat="1"/>
+    <w:lsdException w:name="heading 4" w:semiHidden="1" w:uiPriority="9" w:unhideWhenUsed="1" w:qFormat="1"/>
+    <w:lsdException w:name="heading 5" w:semiHidden="1" w:uiPriority="9" w:unhideWhenUsed="1" w:qFormat="1"/>
+    <w:lsdException w:name="heading 6" w:semiHidden="1" w:uiPriority="9" w:unhideWhenUsed="1" w:qFormat="1"/>
+    <w:lsdException w:name="heading 7" w:semiHidden="1" w:uiPriority="9" w:unhideWhenUsed="1" w:qFormat="1"/>
+    <w:lsdException w:name="heading 8" w:semiHidden="1" w:uiPriority="9" w:unhideWhenUsed="1" w:qFormat="1"/>
+    <w:lsdException w:name="heading 9" w:semiHidden="1" w:uiPriority="9" w:unhideWhenUsed="1" w:qFormat="1"/>
+    <w:lsdException w:name="index 1" w:semiHidden="1" w:unhideWhenUsed="1"/>
+    <w:lsdException w:name="index 2" w:semiHidden="1" w:unhideWhenUsed="1"/>
+    <w:lsdException w:name="index 3" w:semiHidden="1" w:unhideWhenUsed="1"/>
+    <w:lsdException w:name="index 4" w:semiHidden="1" w:unhideWhenUsed="1"/>
+    <w:lsdException w:name="index 5" w:semiHidden="1" w:unhideWhenUsed="1"/>
+    <w:lsdException w:name="index 6" w:semiHidden="1" w:unhideWhenUsed="1"/>
+    <w:lsdException w:name="index 7" w:semiHidden="1" w:unhideWhenUsed="1"/>
+    <w:lsdException w:name="index 8" w:semiHidden="1" w:unhideWhenUsed="1"/>
+    <w:lsdException w:name="index 9" w:semiHidden="1" w:unhideWhenUsed="1"/>
+    <w:lsdException w:name="toc 1" w:semiHidden="1" w:uiPriority="39" w:unhideWhenUsed="1"/>
+    <w:lsdException w:name="toc 2" w:semiHidden="1" w:uiPriority="39" w:unhideWhenUsed="1"/>
+    <w:lsdException w:name="toc 3" w:semiHidden="1" w:uiPriority="39" w:unhideWhenUsed="1"/>
+    <w:lsdException w:name="toc 4" w:semiHidden="1" w:uiPriority="39" w:unhideWhenUsed="1"/>
+    <w:lsdException w:name="toc 5" w:semiHidden="1" w:uiPriority="39" w:unhideWhenUsed="1"/>
+    <w:lsdException w:name="toc 6" w:semiHidden="1" w:uiPriority="39" w:unhideWhenUsed="1"/>
+    <w:lsdException w:name="toc 7" w:semiHidden="1" w:uiPriority="39" w:unhideWhenUsed="1"/>
+    <w:lsdException w:name="toc 8" w:semiHidden="1" w:uiPriority="39" w:unhideWhenUsed="1"/>
+    <w:lsdException w:name="toc 9" w:semiHidden="1" w:uiPriority="39" w:unhideWhenUsed="1"/>
+    <w:lsdException w:name="Normal Indent" w:semiHidden="1" w:unhideWhenUsed="1"/>
+    <w:lsdException w:name="footnote text" w:semiHidden="1" w:unhideWhenUsed="1"/>
+    <w:lsdException w:name="annotation text" w:semiHidden="1" w:unhideWhenUsed="1"/>
+    <w:lsdException w:name="header" w:semiHidden="1" w:unhideWhenUsed="1"/>
+    <w:lsdException w:name="footer" w:semiHidden="1" w:unhideWhenUsed="1"/>
+    <w:lsdException w:name="index heading" w:semiHidden="1" w:unhideWhenUsed="1"/>
+    <w:lsdException w:name="caption" w:semiHidden="1" w:uiPriority="35" w:unhideWhenUsed="1" w:qFormat="1"/>
+    <w:lsdException w:name="table of figures" w:semiHidden="1" w:unhideWhenUsed="1"/>
+    <w:lsdException w:name="envelope address" w:semiHidden="1" w:unhideWhenUsed="1"/>
+    <w:lsdException w:name="envelope return" w:semiHidden="1" w:unhideWhenUsed="1"/>
+    <w:lsdException w:name="footnote reference" w:semiHidden="1" w:unhideWhenUsed="1"/>
+    <w:lsdException w:name="annotation reference" w:semiHidden="1" w:unhideWhenUsed="1"/>
+    <w:lsdException w:name="line number" w:semiHidden="1" w:unhideWhenUsed="1"/>
+    <w:lsdException w:name="page number" w:semiHidden="1" w:unhideWhenUsed="1"/>
+    <w:lsdException w:name="endnote reference" w:semiHidden="1" w:unhideWhenUsed="1"/>
+    <w:lsdException w:name="endnote text" w:semiHidden="1" w:unhideWhenUsed="1"/>
+    <w:lsdException w:name="table of authorities" w:semiHidden="1" w:unhideWhenUsed="1"/>
+    <w:lsdException w:name="macro" w:semiHidden="1" w:unhideWhenUsed="1"/>
+    <w:lsdException w:name="toa heading" w:semiHidden="1" w:unhideWhenUsed="1"/>
+    <w:lsdException w:name="List" w:semiHidden="1" w:unhideWhenUsed="1"/>
+    <w:lsdException w:name="List Bullet" w:semiHidden="1" w:unhideWhenUsed="1"/>
+    <w:lsdException w:name="List Number" w:semiHidden="1" w:unhideWhenUsed="1"/>
+    <w:lsdException w:name="List 2" w:semiHidden="1" w:unhideWhenUsed="1"/>
+    <w:lsdException w:name="List 3" w:semiHidden="1" w:unhideWhenUsed="1"/>
+    <w:lsdException w:name="List 4" w:semiHidden="1" w:unhideWhenUsed="1"/>
+    <w:lsdException w:name="List 5" w:semiHidden="1" w:unhideWhenUsed="1"/>
+    <w:lsdException w:name="List Bullet 2" w:semiHidden="1" w:unhideWhenUsed="1"/>
+    <w:lsdException w:name="List Bullet 3" w:semiHidden="1" w:unhideWhenUsed="1"/>
+    <w:lsdException w:name="List Bullet 4" w:semiHidden="1" w:unhideWhenUsed="1"/>
+    <w:lsdException w:name="List Bullet 5" w:semiHidden="1" w:unhideWhenUsed="1"/>
+    <w:lsdException w:name="List Number 2" w:semiHidden="1" w:unhideWhenUsed="1"/>
+    <w:lsdException w:name="List Number 3" w:semiHidden="1" w:unhideWhenUsed="1"/>
+    <w:lsdException w:name="List Number 4" w:semiHidden="1" w:unhideWhenUsed="1"/>
+    <w:lsdException w:name="List Number 5" w:semiHidden="1" w:unhideWhenUsed="1"/>
+    <w:lsdException w:name="Title" w:uiPriority="10" w:qFormat="1"/>
+    <w:lsdException w:name="Closing" w:semiHidden="1" w:unhideWhenUsed="1"/>
+    <w:lsdException w:name="Signature" w:semiHidden="1" w:unhideWhenUsed="1"/>
+    <w:lsdException w:name="Default Paragraph Font" w:semiHidden="1" w:uiPriority="1" w:unhideWhenUsed="1"/>
+    <w:lsdException w:name="Body Text" w:semiHidden="1" w:unhideWhenUsed="1"/>
+    <w:lsdException w:name="Body Text Indent" w:semiHidden="1" w:unhideWhenUsed="1"/>
+    <w:lsdException w:name="List Continue" w:semiHidden="1" w:unhideWhenUsed="1"/>
+    <w:lsdException w:name="List Continue 2" w:semiHidden="1" w:unhideWhenUsed="1"/>
+    <w:lsdException w:name="List Continue 3" w:semiHidden="1" w:unhideWhenUsed="1"/>
+    <w:lsdException w:name="List Continue 4" w:semiHidden="1" w:unhideWhenUsed="1"/>
+    <w:lsdException w:name="List Continue 5" w:semiHidden="1" w:unhideWhenUsed="1"/>
+    <w:lsdException w:name="Message Header" w:semiHidden="1" w:unhideWhenUsed="1"/>
+    <w:lsdException w:name="Subtitle" w:uiPriority="11" w:qFormat="1"/>
+    <w:lsdException w:name="Salutation" w:semiHidden="1" w:unhideWhenUsed="1"/>
+    <w:lsdException w:name="Date" w:semiHidden="1" w:unhideWhenUsed="1"/>
+    <w:lsdException w:name="Body Text First Indent" w:semiHidden="1" w:unhideWhenUsed="1"/>
+    <w:lsdException w:name="Body Text First Indent 2" w:semiHidden="1" w:unhideWhenUsed="1"/>
+    <w:lsdException w:name="Note Heading" w:semiHidden="1" w:unhideWhenUsed="1"/>
+    <w:lsdException w:name="Body Text 2" w:semiHidden="1" w:unhideWhenUsed="1"/>
+    <w:lsdException w:name="Body Text 3" w:semiHidden="1" w:unhideWhenUsed="1"/>
+    <w:lsdException w:name="Body Text Indent 2" w:semiHidden="1" w:unhideWhenUsed="1"/>
+    <w:lsdException w:name="Body Text Indent 3" w:semiHidden="1" w:unhideWhenUsed="1"/>
+    <w:lsdException w:name="Block Text" w:semiHidden="1" w:unhideWhenUsed="1"/>
+    <w:lsdException w:name="Hyperlink" w:semiHidden="1" w:unhideWhenUsed="1"/>
+    <w:lsdException w:name="FollowedHyperlink" w:semiHidden="1" w:unhideWhenUsed="1"/>
+    <w:lsdException w:name="Strong" w:uiPriority="22" w:qFormat="1"/>
+    <w:lsdException w:name="Emphasis" w:uiPriority="20" w:qFormat="1"/>
+    <w:lsdException w:name="Document Map" w:semiHidden="1" w:unhideWhenUsed="1"/>
+    <w:lsdException w:name="Plain Text" w:semiHidden="1" w:unhideWhenUsed="1"/>
+    <w:lsdException w:name="E-mail Signature" w:semiHidden="1" w:unhideWhenUsed="1"/>
+    <w:lsdException w:name="HTML Top of Form" w:semiHidden="1" w:unhideWhenUsed="1"/>
+    <w:lsdException w:name="HTML Bottom of Form" w:semiHidden="1" w:unhideWhenUsed="1"/>
+    <w:lsdException w:name="Normal (Web)" w:semiHidden="1" w:unhideWhenUsed="1"/>
+    <w:lsdException w:name="HTML Acronym" w:semiHidden="1" w:unhideWhenUsed="1"/>
+    <w:lsdException w:name="HTML Address" w:semiHidden="1" w:unhideWhenUsed="1"/>
+    <w:lsdException w:name="HTML Cite" w:semiHidden="1" w:unhideWhenUsed="1"/>
+    <w:lsdException w:name="HTML Code" w:semiHidden="1" w:unhideWhenUsed="1"/>
+    <w:lsdException w:name="HTML Definition" w:semiHidden="1" w:unhideWhenUsed="1"/>
+    <w:lsdException w:name="HTML Keyboard" w:semiHidden="1" w:unhideWhenUsed="1"/>
+    <w:lsdException w:name="HTML Preformatted" w:semiHidden="1" w:unhideWhenUsed="1"/>
+    <w:lsdException w:name="HTML Sample" w:semiHidden="1" w:unhideWhenUsed="1"/>
+    <w:lsdException w:name="HTML Typewriter" w:semiHidden="1" w:unhideWhenUsed="1"/>
+    <w:lsdException w:name="HTML Variable" w:semiHidden="1" w:unhideWhenUsed="1"/>
+    <w:lsdException w:name="Normal Table" w:semiHidden="1" w:unhideWhenUsed="1"/>
+    <w:lsdException w:name="annotation subject" w:semiHidden="1" w:unhideWhenUsed="1"/>
+    <w:lsdException w:name="No List" w:semiHidden="1" w:unhideWhenUsed="1"/>
+    <w:lsdException w:name="Outline List 1" w:semiHidden="1" w:unhideWhenUsed="1"/>
+    <w:lsdException w:name="Outline List 2" w:semiHidden="1" w:unhideWhenUsed="1"/>
+    <w:lsdException w:name="Outline List 3" w:semiHidden="1" w:unhideWhenUsed="1"/>
+    <w:lsdException w:name="Table Simple 1" w:semiHidden="1" w:unhideWhenUsed="1"/>
+    <w:lsdException w:name="Table Simple 2" w:semiHidden="1" w:unhideWhenUsed="1"/>
+    <w:lsdException w:name="Table Simple 3" w:semiHidden="1" w:unhideWhenUsed="1"/>
+    <w:lsdException w:name="Table Classic 1" w:semiHidden="1" w:unhideWhenUsed="1"/>
+    <w:lsdException w:name="Table Classic 2" w:semiHidden="1" w:unhideWhenUsed="1"/>
+    <w:lsdException w:name="Table Classic 3" w:semiHidden="1" w:unhideWhenUsed="1"/>
+    <w:lsdException w:name="Table Classic 4" w:semiHidden="1" w:unhideWhenUsed="1"/>
+    <w:lsdException w:name="Table Colorful 1" w:semiHidden="1" w:unhideWhenUsed="1"/>
+    <w:lsdException w:name="Table Colorful 2" w:semiHidden="1" w:unhideWhenUsed="1"/>
+    <w:lsdException w:name="Table Colorful 3" w:semiHidden="1" w:unhideWhenUsed="1"/>
+    <w:lsdException w:name="Table Columns 1" w:semiHidden="1" w:unhideWhenUsed="1"/>
+    <w:lsdException w:name="Table Columns 2" w:semiHidden="1" w:unhideWhenUsed="1"/>
+    <w:lsdException w:name="Table Columns 3" w:semiHidden="1" w:unhideWhenUsed="1"/>
+    <w:lsdException w:name="Table Columns 4" w:semiHidden="1" w:unhideWhenUsed="1"/>
+    <w:lsdException w:name="Table Columns 5" w:semiHidden="1" w:unhideWhenUsed="1"/>
+    <w:lsdException w:name="Table Grid 1" w:semiHidden="1" w:unhideWhenUsed="1"/>
+    <w:lsdException w:name="Table Grid 2" w:semiHidden="1" w:unhideWhenUsed="1"/>
+    <w:lsdException w:name="Table Grid 3" w:semiHidden="1" w:unhideWhenUsed="1"/>
+    <w:lsdException w:name="Table Grid 4" w:semiHidden="1" w:unhideWhenUsed="1"/>
+    <w:lsdException w:name="Table Grid 5" w:semiHidden="1" w:unhideWhenUsed="1"/>
+    <w:lsdException w:name="Table Grid 6" w:semiHidden="1" w:unhideWhenUsed="1"/>
+    <w:lsdException w:name="Table Grid 7" w:semiHidden="1" w:unhideWhenUsed="1"/>
+    <w:lsdException w:name="Table Grid 8" w:semiHidden="1" w:unhideWhenUsed="1"/>
+    <w:lsdException w:name="Table List 1" w:semiHidden="1" w:unhideWhenUsed="1"/>
+    <w:lsdException w:name="Table List 2" w:semiHidden="1" w:unhideWhenUsed="1"/>
+    <w:lsdException w:name="Table List 3" w:semiHidden="1" w:unhideWhenUsed="1"/>
+    <w:lsdException w:name="Table List 4" w:semiHidden="1" w:unhideWhenUsed="1"/>
+    <w:lsdException w:name="Table List 5" w:semiHidden="1" w:unhideWhenUsed="1"/>
+    <w:lsdException w:name="Table List 6" w:semiHidden="1" w:unhideWhenUsed="1"/>
+    <w:lsdException w:name="Table List 7" w:semiHidden="1" w:unhideWhenUsed="1"/>
+    <w:lsdException w:name="Table List 8" w:semiHidden="1" w:unhideWhenUsed="1"/>
+    <w:lsdException w:name="Table 3D effects 1" w:semiHidden="1" w:unhideWhenUsed="1"/>
+    <w:lsdException w:name="Table 3D effects 2" w:semiHidden="1" w:unhideWhenUsed="1"/>
+    <w:lsdException w:name="Table 3D effects 3" w:semiHidden="1" w:unhideWhenUsed="1"/>
+    <w:lsdException w:name="Table Contemporary" w:semiHidden="1" w:unhideWhenUsed="1"/>
+    <w:lsdException w:name="Table Elegant" w:semiHidden="1" w:unhideWhenUsed="1"/>
+    <w:lsdException w:name="Table Professional" w:semiHidden="1" w:unhideWhenUsed="1"/>
+    <w:lsdException w:name="Table Subtle 1" w:semiHidden="1" w:unhideWhenUsed="1"/>
+    <w:lsdException w:name="Table Subtle 2" w:semiHidden="1" w:unhideWhenUsed="1"/>
+    <w:lsdException w:name="Table Web 1" w:semiHidden="1" w:unhideWhenUsed="1"/>
+    <w:lsdException w:name="Table Web 2" w:semiHidden="1" w:unhideWhenUsed="1"/>
+    <w:lsdException w:name="Table Web 3" w:semiHidden="1" w:unhideWhenUsed="1"/>
+    <w:lsdException w:name="Balloon Text" w:semiHidden="1" w:unhideWhenUsed="1"/>
+    <w:lsdException w:name="Table Grid" w:uiPriority="39"/>
+    <w:lsdException w:name="Table Theme" w:semiHidden="1" w:unhideWhenUsed="1"/>
+    <w:lsdException w:name="Placeholder Text" w:semiHidden="1"/>
+    <w:lsdException w:name="No Spacing" w:uiPriority="1" w:qFormat="1"/>
+    <w:lsdException w:name="Light Shading" w:uiPriority="60"/>
+    <w:lsdException w:name="Light List" w:uiPriority="61"/>
+    <w:lsdException w:name="Light Grid" w:uiPriority="62"/>
+    <w:lsdException w:name="Medium Shading 1" w:uiPriority="63"/>
+    <w:lsdException w:name="Medium Shading 2" w:uiPriority="64"/>
+    <w:lsdException w:name="Medium List 1" w:uiPriority="65"/>
+    <w:lsdException w:name="Medium List 2" w:uiPriority="66"/>
+    <w:lsdException w:name="Medium Grid 1" w:uiPriority="67"/>
+    <w:lsdException w:name="Medium Grid 2" w:uiPriority="68"/>
+    <w:lsdException w:name="Medium Grid 3" w:uiPriority="69"/>
+    <w:lsdException w:name="Dark List" w:uiPriority="70"/>
+    <w:lsdException w:name="Colorful Shading" w:uiPriority="71"/>
+    <w:lsdException w:name="Colorful List" w:uiPriority="72"/>
+    <w:lsdException w:name="Colorful Grid" w:uiPriority="73"/>
+    <w:lsdException w:name="Light Shading Accent 1" w:uiPriority="60"/>
+    <w:lsdException w:name="Light List Accent 1" w:uiPriority="61"/>
+    <w:lsdException w:name="Light Grid Accent 1" w:uiPriority="62"/>
+    <w:lsdException w:name="Medium Shading 1 Accent 1" w:uiPriority="63"/>
+    <w:lsdException w:name="Medium Shading 2 Accent 1" w:uiPriority="64"/>
+    <w:lsdException w:name="Medium List 1 Accent 1" w:uiPriority="65"/>
+    <w:lsdException w:name="Revision" w:semiHidden="1"/>
+    <w:lsdException w:name="List Paragraph" w:uiPriority="34" w:qFormat="1"/>
+    <w:lsdException w:name="Quote" w:uiPriority="29" w:qFormat="1"/>
+    <w:lsdException w:name="Intense Quote" w:uiPriority="30" w:qFormat="1"/>
+    <w:lsdException w:name="Medium List 2 Accent 1" w:uiPriority="66"/>
+    <w:lsdException w:name="Medium Grid 1 Accent 1" w:uiPriority="67"/>
+    <w:lsdException w:name="Medium Grid 2 Accent 1" w:uiPriority="68"/>
+    <w:lsdException w:name="Medium Grid 3 Accent 1" w:uiPriority="69"/>
+    <w:lsdException w:name="Dark List Accent 1" w:uiPriority="70"/>
+    <w:lsdException w:name="Colorful Shading Accent 1" w:uiPriority="71"/>
+    <w:lsdException w:name="Colorful List Accent 1" w:uiPriority="72"/>
+    <w:lsdException w:name="Colorful Grid Accent 1" w:uiPriority="73"/>
+    <w:lsdException w:name="Light Shading Accent 2" w:uiPriority="60"/>
+    <w:lsdException w:name="Light List Accent 2" w:uiPriority="61"/>
+    <w:lsdException w:name="Light Grid Accent 2" w:uiPriority="62"/>
+    <w:lsdException w:name="Medium Shading 1 Accent 2" w:uiPriority="63"/>
+    <w:lsdException w:name="Medium Shading 2 Accent 2" w:uiPriority="64"/>
+    <w:lsdException w:name="Medium List 1 Accent 2" w:uiPriority="65"/>
+    <w:lsdException w:name="Medium List 2 Accent 2" w:uiPriority="66"/>
+    <w:lsdException w:name="Medium Grid 1 Accent 2" w:uiPriority="67"/>
+    <w:lsdException w:name="Medium Grid 2 Accent 2" w:uiPriority="68"/>
+    <w:lsdException w:name="Medium Grid 3 Accent 2" w:uiPriority="69"/>
+    <w:lsdException w:name="Dark List Accent 2" w:uiPriority="70"/>
+    <w:lsdException w:name="Colorful Shading Accent 2" w:uiPriority="71"/>
+    <w:lsdException w:name="Colorful List Accent 2" w:uiPriority="72"/>
+    <w:lsdException w:name="Colorful Grid Accent 2" w:uiPriority="73"/>
+    <w:lsdException w:name="Light Shading Accent 3" w:uiPriority="60"/>
+    <w:lsdException w:name="Light List Accent 3" w:uiPriority="61"/>
+    <w:lsdException w:name="Light Grid Accent 3" w:uiPriority="62"/>
+    <w:lsdException w:name="Medium Shading 1 Accent 3" w:uiPriority="63"/>
+    <w:lsdException w:name="Medium Shading 2 Accent 3" w:uiPriority="64"/>
+    <w:lsdException w:name="Medium List 1 Accent 3" w:uiPriority="65"/>
+    <w:lsdException w:name="Medium List 2 Accent 3" w:uiPriority="66"/>
+    <w:lsdException w:name="Medium Grid 1 Accent 3" w:uiPriority="67"/>
+    <w:lsdException w:name="Medium Grid 2 Accent 3" w:uiPriority="68"/>
+    <w:lsdException w:name="Medium Grid 3 Accent 3" w:uiPriority="69"/>
+    <w:lsdException w:name="Dark List Accent 3" w:uiPriority="70"/>
+    <w:lsdException w:name="Colorful Shading Accent 3" w:uiPriority="71"/>
+    <w:lsdException w:name="Colorful List Accent 3" w:uiPriority="72"/>
+    <w:lsdException w:name="Colorful Grid Accent 3" w:uiPriority="73"/>
+    <w:lsdException w:name="Light Shading Accent 4" w:uiPriority="60"/>
+    <w:lsdException w:name="Light List Accent 4" w:uiPriority="61"/>
+    <w:lsdException w:name="Light Grid Accent 4" w:uiPriority="62"/>
+    <w:lsdException w:name="Medium Shading 1 Accent 4" w:uiPriority="63"/>
+    <w:lsdException w:name="Medium Shading 2 Accent 4" w:uiPriority="64"/>
+    <w:lsdException w:name="Medium List 1 Accent 4" w:uiPriority="65"/>
+    <w:lsdException w:name="Medium List 2 Accent 4" w:uiPriority="66"/>
+    <w:lsdException w:name="Medium Grid 1 Accent 4" w:uiPriority="67"/>
+    <w:lsdException w:name="Medium Grid 2 Accent 4" w:uiPriority="68"/>
+    <w:lsdException w:name="Medium Grid 3 Accent 4" w:uiPriority="69"/>
+    <w:lsdException w:name="Dark List Accent 4" w:uiPriority="70"/>
+    <w:lsdException w:name="Colorful Shading Accent 4" w:uiPriority="71"/>
+    <w:lsdException w:name="Colorful List Accent 4" w:uiPriority="72"/>
+    <w:lsdException w:name="Colorful Grid Accent 4" w:uiPriority="73"/>
+    <w:lsdException w:name="Light Shading Accent 5" w:uiPriority="60"/>
+    <w:lsdException w:name="Light List Accent 5" w:uiPriority="61"/>
+    <w:lsdException w:name="Light Grid Accent 5" w:uiPriority="62"/>
+    <w:lsdException w:name="Medium Shading 1 Accent 5" w:uiPriority="63"/>
+    <w:lsdException w:name="Medium Shading 2 Accent 5" w:uiPriority="64"/>
+    <w:lsdException w:name="Medium List 1 Accent 5" w:uiPriority="65"/>
+    <w:lsdException w:name="Medium List 2 Accent 5" w:uiPriority="66"/>
+    <w:lsdException w:name="Medium Grid 1 Accent 5" w:uiPriority="67"/>
+    <w:lsdException w:name="Medium Grid 2 Accent 5" w:uiPriority="68"/>
+    <w:lsdException w:name="Medium Grid 3 Accent 5" w:uiPriority="69"/>
+    <w:lsdException w:name="Dark List Accent 5" w:uiPriority="70"/>
+    <w:lsdException w:name="Colorful Shading Accent 5" w:uiPriority="71"/>
+    <w:lsdException w:name="Colorful List Accent 5" w:uiPriority="72"/>
+    <w:lsdException w:name="Colorful Grid Accent 5" w:uiPriority="73"/>
+    <w:lsdException w:name="Light Shading Accent 6" w:uiPriority="60"/>
+    <w:lsdException w:name="Light List Accent 6" w:uiPriority="61"/>
+    <w:lsdException w:name="Light Grid Accent 6" w:uiPriority="62"/>
+    <w:lsdException w:name="Medium Shading 1 Accent 6" w:uiPriority="63"/>
+    <w:lsdException w:name="Medium Shading 2 Accent 6" w:uiPriority="64"/>
+    <w:lsdException w:name="Medium List 1 Accent 6" w:uiPriority="65"/>
+    <w:lsdException w:name="Medium List 2 Accent 6" w:uiPriority="66"/>
+    <w:lsdException w:name="Medium Grid 1 Accent 6" w:uiPriority="67"/>
+    <w:lsdException w:name="Medium Grid 2 Accent 6" w:uiPriority="68"/>
+    <w:lsdException w:name="Medium Grid 3 Accent 6" w:uiPriority="69"/>
+    <w:lsdException w:name="Dark List Accent 6" w:uiPriority="70"/>
+    <w:lsdException w:name="Colorful Shading Accent 6" w:uiPriority="71"/>
+    <w:lsdException w:name="Colorful List Accent 6" w:uiPriority="72"/>
+    <w:lsdException w:name="Colorful Grid Accent 6" w:uiPriority="73"/>
+    <w:lsdException w:name="Subtle Emphasis" w:uiPriority="19" w:qFormat="1"/>
+    <w:lsdException w:name="Intense Emphasis" w:uiPriority="21" w:qFormat="1"/>
+    <w:lsdException w:name="Subtle Reference" w:uiPriority="31" w:qFormat="1"/>
+    <w:lsdException w:name="Intense Reference" w:uiPriority="32" w:qFormat="1"/>
+    <w:lsdException w:name="Book Title" w:uiPriority="33" w:qFormat="1"/>
+    <w:lsdException w:name="Bibliography" w:semiHidden="1" w:uiPriority="37" w:unhideWhenUsed="1"/>
+    <w:lsdException w:name="TOC Heading" w:semiHidden="1" w:uiPriority="39" w:unhideWhenUsed="1" w:qFormat="1"/>
+    <w:lsdException w:name="Plain Table 1" w:uiPriority="41"/>
+    <w:lsdException w:name="Plain Table 2" w:uiPriority="42"/>
+    <w:lsdException w:name="Plain Table 3" w:uiPriority="43"/>
+    <w:lsdException w:name="Plain Table 4" w:uiPriority="44"/>
+    <w:lsdException w:name="Plain Table 5" w:uiPriority="45"/>
+    <w:lsdException w:name="Grid Table Light" w:uiPriority="40"/>
+    <w:lsdException w:name="Grid Table 1 Light" w:uiPriority="46"/>
+    <w:lsdException w:name="Grid Table 2" w:uiPriority="47"/>
+    <w:lsdException w:name="Grid Table 3" w:uiPriority="48"/>
+    <w:lsdException w:name="Grid Table 4" w:uiPriority="49"/>
+    <w:lsdException w:name="Grid Table 5 Dark" w:uiPriority="50"/>
+    <w:lsdException w:name="Grid Table 6 Colorful" w:uiPriority="51"/>
+    <w:lsdException w:name="Grid Table 7 Colorful" w:uiPriority="52"/>
+    <w:lsdException w:name="Grid Table 1 Light Accent 1" w:uiPriority="46"/>
+    <w:lsdException w:name="Grid Table 2 Accent 1" w:uiPriority="47"/>
+    <w:lsdException w:name="Grid Table 3 Accent 1" w:uiPriority="48"/>
+    <w:lsdException w:name="Grid Table 4 Accent 1" w:uiPriority="49"/>
+    <w:lsdException w:name="Grid Table 5 Dark Accent 1" w:uiPriority="50"/>
+    <w:lsdException w:name="Grid Table 6 Colorful Accent 1" w:uiPriority="51"/>
+    <w:lsdException w:name="Grid Table 7 Colorful Accent 1" w:uiPriority="52"/>
+    <w:lsdException w:name="Grid Table 1 Light Accent 2" w:uiPriority="46"/>
+    <w:lsdException w:name="Grid Table 2 Accent 2" w:uiPriority="47"/>
+    <w:lsdException w:name="Grid Table 3 Accent 2" w:uiPriority="48"/>
+    <w:lsdException w:name="Grid Table 4 Accent 2" w:uiPriority="49"/>
+    <w:lsdException w:name="Grid Table 5 Dark Accent 2" w:uiPriority="50"/>
+    <w:lsdException w:name="Grid Table 6 Colorful Accent 2" w:uiPriority="51"/>
+    <w:lsdException w:name="Grid Table 7 Colorful Accent 2" w:uiPriority="52"/>
+    <w:lsdException w:name="Grid Table 1 Light Accent 3" w:uiPriority="46"/>
+    <w:lsdException w:name="Grid Table 2 Accent 3" w:uiPriority="47"/>
+    <w:lsdException w:name="Grid Table 3 Accent 3" w:uiPriority="48"/>
+    <w:lsdException w:name="Grid Table 4 Accent 3" w:uiPriority="49"/>
+    <w:lsdException w:name="Grid Table 5 Dark Accent 3" w:uiPriority="50"/>
+    <w:lsdException w:name="Grid Table 6 Colorful Accent 3" w:uiPriority="51"/>
+    <w:lsdException w:name="Grid Table 7 Colorful Accent 3" w:uiPriority="52"/>
+    <w:lsdException w:name="Grid Table 1 Light Accent 4" w:uiPriority="46"/>
+    <w:lsdException w:name="Grid Table 2 Accent 4" w:uiPriority="47"/>
+    <w:lsdException w:name="Grid Table 3 Accent 4" w:uiPriority="48"/>
+    <w:lsdException w:name="Grid Table 4 Accent 4" w:uiPriority="49"/>
+    <w:lsdException w:name="Grid Table 5 Dark Accent 4" w:uiPriority="50"/>
+    <w:lsdException w:name="Grid Table 6 Colorful Accent 4" w:uiPriority="51"/>
+    <w:lsdException w:name="Grid Table 7 Colorful Accent 4" w:uiPriority="52"/>
+    <w:lsdException w:name="Grid Table 1 Light Accent 5" w:uiPriority="46"/>
+    <w:lsdException w:name="Grid Table 2 Accent 5" w:uiPriority="47"/>
+    <w:lsdException w:name="Grid Table 3 Accent 5" w:uiPriority="48"/>
+    <w:lsdException w:name="Grid Table 4 Accent 5" w:uiPriority="49"/>
+    <w:lsdException w:name="Grid Table 5 Dark Accent 5" w:uiPriority="50"/>
+    <w:lsdException w:name="Grid Table 6 Colorful Accent 5" w:uiPriority="51"/>
+    <w:lsdException w:name="Grid Table 7 Colorful Accent 5" w:uiPriority="52"/>
+    <w:lsdException w:name="Grid Table 1 Light Accent 6" w:uiPriority="46"/>
+    <w:lsdException w:name="Grid Table 2 Accent 6" w:uiPriority="47"/>
+    <w:lsdException w:name="Grid Table 3 Accent 6" w:uiPriority="48"/>
+    <w:lsdException w:name="Grid Table 4 Accent 6" w:uiPriority="49"/>
+    <w:lsdException w:name="Grid Table 5 Dark Accent 6" w:uiPriority="50"/>
+    <w:lsdException w:name="Grid Table 6 Colorful Accent 6" w:uiPriority="51"/>
+    <w:lsdException w:name="Grid Table 7 Colorful Accent 6" w:uiPriority="52"/>
+    <w:lsdException w:name="List Table 1 Light" w:uiPriority="46"/>
+    <w:lsdException w:name="List Table 2" w:uiPriority="47"/>
+    <w:lsdException w:name="List Table 3" w:uiPriority="48"/>
+    <w:lsdException w:name="List Table 4" w:uiPriority="49"/>
+    <w:lsdException w:name="List Table 5 Dark" w:uiPriority="50"/>
+    <w:lsdException w:name="List Table 6 Colorful" w:uiPriority="51"/>
+    <w:lsdException w:name="List Table 7 Colorful" w:uiPriority="52"/>
+    <w:lsdException w:name="List Table 1 Light Accent 1" w:uiPriority="46"/>
+    <w:lsdException w:name="List Table 2 Accent 1" w:uiPriority="47"/>
+    <w:lsdException w:name="List Table 3 Accent 1" w:uiPriority="48"/>
+    <w:lsdException w:name="List Table 4 Accent 1" w:uiPriority="49"/>
+    <w:lsdException w:name="List Table 5 Dark Accent 1" w:uiPriority="50"/>
+    <w:lsdException w:name="List Table 6 Colorful Accent 1" w:uiPriority="51"/>
+    <w:lsdException w:name="List Table 7 Colorful Accent 1" w:uiPriority="52"/>
+    <w:lsdException w:name="List Table 1 Light Accent 2" w:uiPriority="46"/>
+    <w:lsdException w:name="List Table 2 Accent 2" w:uiPriority="47"/>
+    <w:lsdException w:name="List Table 3 Accent 2" w:uiPriority="48"/>
+    <w:lsdException w:name="List Table 4 Accent 2" w:uiPriority="49"/>
+    <w:lsdException w:name="List Table 5 Dark Accent 2" w:uiPriority="50"/>
+    <w:lsdException w:name="List Table 6 Colorful Accent 2" w:uiPriority="51"/>
+    <w:lsdException w:name="List Table 7 Colorful Accent 2" w:uiPriority="52"/>
+    <w:lsdException w:name="List Table 1 Light Accent 3" w:uiPriority="46"/>
+    <w:lsdException w:name="List Table 2 Accent 3" w:uiPriority="47"/>
+    <w:lsdException w:name="List Table 3 Accent 3" w:uiPriority="48"/>
+    <w:lsdException w:name="List Table 4 Accent 3" w:uiPriority="49"/>
+    <w:lsdException w:name="List Table 5 Dark Accent 3" w:uiPriority="50"/>
+    <w:lsdException w:name="List Table 6 Colorful Accent 3" w:uiPriority="51"/>
+    <w:lsdException w:name="List Table 7 Colorful Accent 3" w:uiPriority="52"/>
+    <w:lsdException w:name="List Table 1 Light Accent 4" w:uiPriority="46"/>
+    <w:lsdException w:name="List Table 2 Accent 4" w:uiPriority="47"/>
+    <w:lsdException w:name="List Table 3 Accent 4" w:uiPriority="48"/>
+    <w:lsdException w:name="List Table 4 Accent 4" w:uiPriority="49"/>
+    <w:lsdException w:name="List Table 5 Dark Accent 4" w:uiPriority="50"/>
+    <w:lsdException w:name="List Table 6 Colorful Accent 4" w:uiPriority="51"/>
+    <w:lsdException w:name="List Table 7 Colorful Accent 4" w:uiPriority="52"/>
+    <w:lsdException w:name="List Table 1 Light Accent 5" w:uiPriority="46"/>
+    <w:lsdException w:name="List Table 2 Accent 5" w:uiPriority="47"/>
+    <w:lsdException w:name="List Table 3 Accent 5" w:uiPriority="48"/>
+    <w:lsdException w:name="List Table 4 Accent 5" w:uiPriority="49"/>
+    <w:lsdException w:name="List Table 5 Dark Accent 5" w:uiPriority="50"/>
+    <w:lsdException w:name="List Table 6 Colorful Accent 5" w:uiPriority="51"/>
+    <w:lsdException w:name="List Table 7 Colorful Accent 5" w:uiPriority="52"/>
+    <w:lsdException w:name="List Table 1 Light Accent 6" w:uiPriority="46"/>
+    <w:lsdException w:name="List Table 2 Accent 6" w:uiPriority="47"/>
+    <w:lsdException w:name="List Table 3 Accent 6" w:uiPriority="48"/>
+    <w:lsdException w:name="List Table 4 Accent 6" w:uiPriority="49"/>
+    <w:lsdException w:name="List Table 5 Dark Accent 6" w:uiPriority="50"/>
+    <w:lsdException w:name="List Table 6 Colorful Accent 6" w:uiPriority="51"/>
+    <w:lsdException w:name="List Table 7 Colorful Accent 6" w:uiPriority="52"/>
+    <w:lsdException w:name="Mention" w:semiHidden="1" w:unhideWhenUsed="1"/>
+    <w:lsdException w:name="Smart Hyperlink" w:semiHidden="1" w:unhideWhenUsed="1"/>
+    <w:lsdException w:name="Hashtag" w:semiHidden="1" w:unhideWhenUsed="1"/>
+    <w:lsdException w:name="Unresolved Mention" w:semiHidden="1" w:unhideWhenUsed="1"/>
+    <w:lsdException w:name="Smart Link" w:semiHidden="1" w:unhideWhenUsed="1"/>
+  </w:latentStyles>
+  <w:style w:type="paragraph" w:default="1" w:styleId="Normal">
+    <w:name w:val="Normal"/>
     <w:qFormat/>
-    <w:rPr>
-      <w:sz w:val="56"/>
-      <w:szCs w:val="56"/>
-    </w:rPr>
   </w:style>
   <w:style w:type="paragraph" w:styleId="Heading1">
-    <w:name w:val="Heading 1"/>
-    <w:basedOn w:val="Normal"/>
-    <w:next w:val="Normal"/>
+    <w:name w:val="heading 1"/>
+    <w:uiPriority w:val="9"/>
     <w:qFormat/>
+    <w:pPr>
+      <w:spacing w:before="360" w:after="200"/>
+      <w:outlineLvl w:val="0"/>
+    </w:pPr>
     <w:rPr>
-      <w:color w:val="2E74B5"/>
+      <w:b/>
+      <w:bCs/>
+      <w:color w:val="2E2E2E"/>
       <w:sz w:val="32"/>
       <w:szCs w:val="32"/>
     </w:rPr>
   </w:style>
   <w:style w:type="paragraph" w:styleId="Heading2">
-    <w:name w:val="Heading 2"/>
-    <w:basedOn w:val="Normal"/>
-    <w:next w:val="Normal"/>
+    <w:name w:val="heading 2"/>
+    <w:uiPriority w:val="9"/>
+    <w:semiHidden/>
+    <w:unhideWhenUsed/>
     <w:qFormat/>
+    <w:pPr>
+      <w:spacing w:before="240" w:after="120"/>
+      <w:outlineLvl w:val="1"/>
+    </w:pPr>
     <w:rPr>
-      <w:color w:val="2E74B5"/>
+      <w:b/>
+      <w:bCs/>
+      <w:color w:val="2E2E2E"/>
       <w:sz w:val="26"/>
       <w:szCs w:val="26"/>
     </w:rPr>
   </w:style>
   <w:style w:type="paragraph" w:styleId="Heading3">
-    <w:name w:val="Heading 3"/>
-    <w:basedOn w:val="Normal"/>
-    <w:next w:val="Normal"/>
+    <w:name w:val="heading 3"/>
+    <w:uiPriority w:val="9"/>
+    <w:semiHidden/>
+    <w:unhideWhenUsed/>
     <w:qFormat/>
+    <w:pPr>
+      <w:outlineLvl w:val="2"/>
+    </w:pPr>
     <w:rPr>
       <w:color w:val="1F4D78"/>
       <w:sz w:val="24"/>
@@ -2039,10 +2326,14 @@
     </w:rPr>
   </w:style>
   <w:style w:type="paragraph" w:styleId="Heading4">
-    <w:name w:val="Heading 4"/>
-    <w:basedOn w:val="Normal"/>
-    <w:next w:val="Normal"/>
+    <w:name w:val="heading 4"/>
+    <w:uiPriority w:val="9"/>
+    <w:semiHidden/>
+    <w:unhideWhenUsed/>
     <w:qFormat/>
+    <w:pPr>
+      <w:outlineLvl w:val="3"/>
+    </w:pPr>
     <w:rPr>
       <w:i/>
       <w:iCs/>
@@ -2050,27 +2341,69 @@
     </w:rPr>
   </w:style>
   <w:style w:type="paragraph" w:styleId="Heading5">
-    <w:name w:val="Heading 5"/>
-    <w:basedOn w:val="Normal"/>
-    <w:next w:val="Normal"/>
+    <w:name w:val="heading 5"/>
+    <w:uiPriority w:val="9"/>
+    <w:semiHidden/>
+    <w:unhideWhenUsed/>
     <w:qFormat/>
+    <w:pPr>
+      <w:outlineLvl w:val="4"/>
+    </w:pPr>
     <w:rPr>
       <w:color w:val="2E74B5"/>
     </w:rPr>
   </w:style>
   <w:style w:type="paragraph" w:styleId="Heading6">
-    <w:name w:val="Heading 6"/>
-    <w:basedOn w:val="Normal"/>
-    <w:next w:val="Normal"/>
+    <w:name w:val="heading 6"/>
+    <w:uiPriority w:val="9"/>
+    <w:semiHidden/>
+    <w:unhideWhenUsed/>
     <w:qFormat/>
+    <w:pPr>
+      <w:outlineLvl w:val="5"/>
+    </w:pPr>
     <w:rPr>
       <w:color w:val="1F4D78"/>
     </w:rPr>
   </w:style>
-  <w:style w:type="paragraph" w:styleId="Strong">
-    <w:name w:val="Strong"/>
-    <w:basedOn w:val="Normal"/>
-    <w:next w:val="Normal"/>
+  <w:style w:type="character" w:default="1" w:styleId="DefaultParagraphFont">
+    <w:name w:val="Default Paragraph Font"/>
+    <w:uiPriority w:val="1"/>
+    <w:semiHidden/>
+    <w:unhideWhenUsed/>
+  </w:style>
+  <w:style w:type="table" w:default="1" w:styleId="TableNormal">
+    <w:name w:val="Normal Table"/>
+    <w:uiPriority w:val="99"/>
+    <w:semiHidden/>
+    <w:unhideWhenUsed/>
+    <w:tblPr>
+      <w:tblInd w:w="0" w:type="dxa"/>
+      <w:tblCellMar>
+        <w:top w:w="0" w:type="dxa"/>
+        <w:left w:w="108" w:type="dxa"/>
+        <w:bottom w:w="0" w:type="dxa"/>
+        <w:right w:w="108" w:type="dxa"/>
+      </w:tblCellMar>
+    </w:tblPr>
+  </w:style>
+  <w:style w:type="numbering" w:default="1" w:styleId="NoList">
+    <w:name w:val="No List"/>
+    <w:uiPriority w:val="99"/>
+    <w:semiHidden/>
+    <w:unhideWhenUsed/>
+  </w:style>
+  <w:style w:type="paragraph" w:styleId="Title">
+    <w:name w:val="Title"/>
+    <w:uiPriority w:val="10"/>
+    <w:qFormat/>
+    <w:rPr>
+      <w:sz w:val="56"/>
+      <w:szCs w:val="56"/>
+    </w:rPr>
+  </w:style>
+  <w:style w:type="paragraph" w:customStyle="1" w:styleId="Strong1">
+    <w:name w:val="Strong1"/>
     <w:qFormat/>
     <w:rPr>
       <w:b/>
@@ -2079,12 +2412,10 @@
   </w:style>
   <w:style w:type="paragraph" w:styleId="ListParagraph">
     <w:name w:val="List Paragraph"/>
-    <w:basedOn w:val="Normal"/>
     <w:qFormat/>
   </w:style>
   <w:style w:type="character" w:styleId="Hyperlink">
     <w:name w:val="Hyperlink"/>
-    <w:basedOn w:val="DefaultParagraphFont"/>
     <w:uiPriority w:val="99"/>
     <w:unhideWhenUsed/>
     <w:rPr>
@@ -2094,7 +2425,6 @@
   </w:style>
   <w:style w:type="character" w:styleId="FootnoteReference">
     <w:name w:val="footnote reference"/>
-    <w:basedOn w:val="DefaultParagraphFont"/>
     <w:uiPriority w:val="99"/>
     <w:semiHidden/>
     <w:unhideWhenUsed/>
@@ -2104,22 +2434,17 @@
   </w:style>
   <w:style w:type="paragraph" w:styleId="FootnoteText">
     <w:name w:val="footnote text"/>
-    <w:basedOn w:val="Normal"/>
     <w:link w:val="FootnoteTextChar"/>
     <w:uiPriority w:val="99"/>
     <w:semiHidden/>
     <w:unhideWhenUsed/>
-    <w:pPr>
-      <w:spacing w:after="0" w:line="240" w:lineRule="auto"/>
-    </w:pPr>
     <w:rPr>
       <w:sz w:val="20"/>
       <w:szCs w:val="20"/>
     </w:rPr>
   </w:style>
-  <w:style w:type="character" w:styleId="FootnoteTextChar">
+  <w:style w:type="character" w:customStyle="1" w:styleId="FootnoteTextChar">
     <w:name w:val="Footnote Text Char"/>
-    <w:basedOn w:val="DefaultParagraphFont"/>
     <w:link w:val="FootnoteText"/>
     <w:uiPriority w:val="99"/>
     <w:semiHidden/>
@@ -2129,41 +2454,320 @@
       <w:szCs w:val="20"/>
     </w:rPr>
   </w:style>
-  <w:style w:type="paragraph" w:styleId="Heading1">
-    <w:name w:val="Heading 1"/>
-    <w:basedOn w:val="Normal"/>
-    <w:next w:val="Normal"/>
-    <w:qFormat/>
-    <w:pPr>
-      <w:spacing w:before="360" w:after="200"/>
-      <w:outlineLvl w:val="0"/>
-    </w:pPr>
-    <w:rPr>
-      <w:rFonts w:ascii="Arial" w:cs="Arial" w:eastAsia="Arial" w:hAnsi="Arial"/>
-      <w:b/>
-      <w:bCs/>
-      <w:color w:val="2E2E2E"/>
-      <w:sz w:val="32"/>
-      <w:szCs w:val="32"/>
-    </w:rPr>
-  </w:style>
-  <w:style w:type="paragraph" w:styleId="Heading2">
-    <w:name w:val="Heading 2"/>
-    <w:basedOn w:val="Normal"/>
-    <w:next w:val="Normal"/>
-    <w:qFormat/>
-    <w:pPr>
-      <w:spacing w:before="240" w:after="120"/>
-      <w:outlineLvl w:val="1"/>
-    </w:pPr>
-    <w:rPr>
-      <w:rFonts w:ascii="Arial" w:cs="Arial" w:eastAsia="Arial" w:hAnsi="Arial"/>
-      <w:b/>
-      <w:bCs/>
-      <w:color w:val="2E2E2E"/>
-      <w:sz w:val="26"/>
-      <w:szCs w:val="26"/>
-    </w:rPr>
-  </w:style>
 </w:styles>
+</file>
+
+<file path=word/theme/theme1.xml><?xml version="1.0" encoding="utf-8"?>
+<a:theme xmlns:a="http://schemas.openxmlformats.org/drawingml/2006/main" name="Office Theme">
+  <a:themeElements>
+    <a:clrScheme name="Office">
+      <a:dk1>
+        <a:sysClr val="windowText" lastClr="000000"/>
+      </a:dk1>
+      <a:lt1>
+        <a:sysClr val="window" lastClr="FFFFFF"/>
+      </a:lt1>
+      <a:dk2>
+        <a:srgbClr val="0E2841"/>
+      </a:dk2>
+      <a:lt2>
+        <a:srgbClr val="E8E8E8"/>
+      </a:lt2>
+      <a:accent1>
+        <a:srgbClr val="156082"/>
+      </a:accent1>
+      <a:accent2>
+        <a:srgbClr val="E97132"/>
+      </a:accent2>
+      <a:accent3>
+        <a:srgbClr val="196B24"/>
+      </a:accent3>
+      <a:accent4>
+        <a:srgbClr val="0F9ED5"/>
+      </a:accent4>
+      <a:accent5>
+        <a:srgbClr val="A02B93"/>
+      </a:accent5>
+      <a:accent6>
+        <a:srgbClr val="4EA72E"/>
+      </a:accent6>
+      <a:hlink>
+        <a:srgbClr val="467886"/>
+      </a:hlink>
+      <a:folHlink>
+        <a:srgbClr val="96607D"/>
+      </a:folHlink>
+    </a:clrScheme>
+    <a:fontScheme name="Office">
+      <a:majorFont>
+        <a:latin typeface="Aptos Display" panose="02110004020202020204"/>
+        <a:ea typeface=""/>
+        <a:cs typeface=""/>
+        <a:font script="Jpan" typeface="游ゴシック Light"/>
+        <a:font script="Hang" typeface="맑은 고딕"/>
+        <a:font script="Hans" typeface="等线 Light"/>
+        <a:font script="Hant" typeface="新細明體"/>
+        <a:font script="Arab" typeface="Times New Roman"/>
+        <a:font script="Hebr" typeface="Times New Roman"/>
+        <a:font script="Thai" typeface="Angsana New"/>
+        <a:font script="Ethi" typeface="Nyala"/>
+        <a:font script="Beng" typeface="Vrinda"/>
+        <a:font script="Gujr" typeface="Shruti"/>
+        <a:font script="Khmr" typeface="MoolBoran"/>
+        <a:font script="Knda" typeface="Tunga"/>
+        <a:font script="Guru" typeface="Raavi"/>
+        <a:font script="Cans" typeface="Euphemia"/>
+        <a:font script="Cher" typeface="Plantagenet Cherokee"/>
+        <a:font script="Yiii" typeface="Microsoft Yi Baiti"/>
+        <a:font script="Tibt" typeface="Microsoft Himalaya"/>
+        <a:font script="Thaa" typeface="MV Boli"/>
+        <a:font script="Deva" typeface="Mangal"/>
+        <a:font script="Telu" typeface="Gautami"/>
+        <a:font script="Taml" typeface="Latha"/>
+        <a:font script="Syrc" typeface="Estrangelo Edessa"/>
+        <a:font script="Orya" typeface="Kalinga"/>
+        <a:font script="Mlym" typeface="Kartika"/>
+        <a:font script="Laoo" typeface="DokChampa"/>
+        <a:font script="Sinh" typeface="Iskoola Pota"/>
+        <a:font script="Mong" typeface="Mongolian Baiti"/>
+        <a:font script="Viet" typeface="Times New Roman"/>
+        <a:font script="Uigh" typeface="Microsoft Uighur"/>
+        <a:font script="Geor" typeface="Sylfaen"/>
+        <a:font script="Armn" typeface="Arial"/>
+        <a:font script="Bugi" typeface="Leelawadee UI"/>
+        <a:font script="Bopo" typeface="Microsoft JhengHei"/>
+        <a:font script="Java" typeface="Javanese Text"/>
+        <a:font script="Lisu" typeface="Segoe UI"/>
+        <a:font script="Mymr" typeface="Myanmar Text"/>
+        <a:font script="Nkoo" typeface="Ebrima"/>
+        <a:font script="Olck" typeface="Nirmala UI"/>
+        <a:font script="Osma" typeface="Ebrima"/>
+        <a:font script="Phag" typeface="Phagspa"/>
+        <a:font script="Syrn" typeface="Estrangelo Edessa"/>
+        <a:font script="Syrj" typeface="Estrangelo Edessa"/>
+        <a:font script="Syre" typeface="Estrangelo Edessa"/>
+        <a:font script="Sora" typeface="Nirmala UI"/>
+        <a:font script="Tale" typeface="Microsoft Tai Le"/>
+        <a:font script="Talu" typeface="Microsoft New Tai Lue"/>
+        <a:font script="Tfng" typeface="Ebrima"/>
+      </a:majorFont>
+      <a:minorFont>
+        <a:latin typeface="Aptos" panose="02110004020202020204"/>
+        <a:ea typeface=""/>
+        <a:cs typeface=""/>
+        <a:font script="Jpan" typeface="游明朝"/>
+        <a:font script="Hang" typeface="맑은 고딕"/>
+        <a:font script="Hans" typeface="等线"/>
+        <a:font script="Hant" typeface="新細明體"/>
+        <a:font script="Arab" typeface="Arial"/>
+        <a:font script="Hebr" typeface="Arial"/>
+        <a:font script="Thai" typeface="Cordia New"/>
+        <a:font script="Ethi" typeface="Nyala"/>
+        <a:font script="Beng" typeface="Vrinda"/>
+        <a:font script="Gujr" typeface="Shruti"/>
+        <a:font script="Khmr" typeface="DaunPenh"/>
+        <a:font script="Knda" typeface="Tunga"/>
+        <a:font script="Guru" typeface="Raavi"/>
+        <a:font script="Cans" typeface="Euphemia"/>
+        <a:font script="Cher" typeface="Plantagenet Cherokee"/>
+        <a:font script="Yiii" typeface="Microsoft Yi Baiti"/>
+        <a:font script="Tibt" typeface="Microsoft Himalaya"/>
+        <a:font script="Thaa" typeface="MV Boli"/>
+        <a:font script="Deva" typeface="Mangal"/>
+        <a:font script="Telu" typeface="Gautami"/>
+        <a:font script="Taml" typeface="Latha"/>
+        <a:font script="Syrc" typeface="Estrangelo Edessa"/>
+        <a:font script="Orya" typeface="Kalinga"/>
+        <a:font script="Mlym" typeface="Kartika"/>
+        <a:font script="Laoo" typeface="DokChampa"/>
+        <a:font script="Sinh" typeface="Iskoola Pota"/>
+        <a:font script="Mong" typeface="Mongolian Baiti"/>
+        <a:font script="Viet" typeface="Arial"/>
+        <a:font script="Uigh" typeface="Microsoft Uighur"/>
+        <a:font script="Geor" typeface="Sylfaen"/>
+        <a:font script="Armn" typeface="Arial"/>
+        <a:font script="Bugi" typeface="Leelawadee UI"/>
+        <a:font script="Bopo" typeface="Microsoft JhengHei"/>
+        <a:font script="Java" typeface="Javanese Text"/>
+        <a:font script="Lisu" typeface="Segoe UI"/>
+        <a:font script="Mymr" typeface="Myanmar Text"/>
+        <a:font script="Nkoo" typeface="Ebrima"/>
+        <a:font script="Olck" typeface="Nirmala UI"/>
+        <a:font script="Osma" typeface="Ebrima"/>
+        <a:font script="Phag" typeface="Phagspa"/>
+        <a:font script="Syrn" typeface="Estrangelo Edessa"/>
+        <a:font script="Syrj" typeface="Estrangelo Edessa"/>
+        <a:font script="Syre" typeface="Estrangelo Edessa"/>
+        <a:font script="Sora" typeface="Nirmala UI"/>
+        <a:font script="Tale" typeface="Microsoft Tai Le"/>
+        <a:font script="Talu" typeface="Microsoft New Tai Lue"/>
+        <a:font script="Tfng" typeface="Ebrima"/>
+      </a:minorFont>
+    </a:fontScheme>
+    <a:fmtScheme name="Office">
+      <a:fillStyleLst>
+        <a:solidFill>
+          <a:schemeClr val="phClr"/>
+        </a:solidFill>
+        <a:gradFill rotWithShape="1">
+          <a:gsLst>
+            <a:gs pos="0">
+              <a:schemeClr val="phClr">
+                <a:lumMod val="110000"/>
+                <a:satMod val="105000"/>
+                <a:tint val="67000"/>
+              </a:schemeClr>
+            </a:gs>
+            <a:gs pos="50000">
+              <a:schemeClr val="phClr">
+                <a:lumMod val="105000"/>
+                <a:satMod val="103000"/>
+                <a:tint val="73000"/>
+              </a:schemeClr>
+            </a:gs>
+            <a:gs pos="100000">
+              <a:schemeClr val="phClr">
+                <a:lumMod val="105000"/>
+                <a:satMod val="109000"/>
+                <a:tint val="81000"/>
+              </a:schemeClr>
+            </a:gs>
+          </a:gsLst>
+          <a:lin ang="5400000" scaled="0"/>
+        </a:gradFill>
+        <a:gradFill rotWithShape="1">
+          <a:gsLst>
+            <a:gs pos="0">
+              <a:schemeClr val="phClr">
+                <a:satMod val="103000"/>
+                <a:lumMod val="102000"/>
+                <a:tint val="94000"/>
+              </a:schemeClr>
+            </a:gs>
+            <a:gs pos="50000">
+              <a:schemeClr val="phClr">
+                <a:satMod val="110000"/>
+                <a:lumMod val="100000"/>
+                <a:shade val="100000"/>
+              </a:schemeClr>
+            </a:gs>
+            <a:gs pos="100000">
+              <a:schemeClr val="phClr">
+                <a:lumMod val="99000"/>
+                <a:satMod val="120000"/>
+                <a:shade val="78000"/>
+              </a:schemeClr>
+            </a:gs>
+          </a:gsLst>
+          <a:lin ang="5400000" scaled="0"/>
+        </a:gradFill>
+      </a:fillStyleLst>
+      <a:lnStyleLst>
+        <a:ln w="12700" cap="flat" cmpd="sng" algn="ctr">
+          <a:solidFill>
+            <a:schemeClr val="phClr"/>
+          </a:solidFill>
+          <a:prstDash val="solid"/>
+          <a:miter lim="800000"/>
+        </a:ln>
+        <a:ln w="19050" cap="flat" cmpd="sng" algn="ctr">
+          <a:solidFill>
+            <a:schemeClr val="phClr"/>
+          </a:solidFill>
+          <a:prstDash val="solid"/>
+          <a:miter lim="800000"/>
+        </a:ln>
+        <a:ln w="25400" cap="flat" cmpd="sng" algn="ctr">
+          <a:solidFill>
+            <a:schemeClr val="phClr"/>
+          </a:solidFill>
+          <a:prstDash val="solid"/>
+          <a:miter lim="800000"/>
+        </a:ln>
+      </a:lnStyleLst>
+      <a:effectStyleLst>
+        <a:effectStyle>
+          <a:effectLst/>
+        </a:effectStyle>
+        <a:effectStyle>
+          <a:effectLst/>
+        </a:effectStyle>
+        <a:effectStyle>
+          <a:effectLst>
+            <a:outerShdw blurRad="57150" dist="19050" dir="5400000" algn="ctr" rotWithShape="0">
+              <a:srgbClr val="000000">
+                <a:alpha val="63000"/>
+              </a:srgbClr>
+            </a:outerShdw>
+          </a:effectLst>
+        </a:effectStyle>
+      </a:effectStyleLst>
+      <a:bgFillStyleLst>
+        <a:solidFill>
+          <a:schemeClr val="phClr"/>
+        </a:solidFill>
+        <a:solidFill>
+          <a:schemeClr val="phClr">
+            <a:tint val="95000"/>
+            <a:satMod val="170000"/>
+          </a:schemeClr>
+        </a:solidFill>
+        <a:gradFill rotWithShape="1">
+          <a:gsLst>
+            <a:gs pos="0">
+              <a:schemeClr val="phClr">
+                <a:tint val="93000"/>
+                <a:satMod val="150000"/>
+                <a:shade val="98000"/>
+                <a:lumMod val="102000"/>
+              </a:schemeClr>
+            </a:gs>
+            <a:gs pos="50000">
+              <a:schemeClr val="phClr">
+                <a:tint val="98000"/>
+                <a:satMod val="130000"/>
+                <a:shade val="90000"/>
+                <a:lumMod val="103000"/>
+              </a:schemeClr>
+            </a:gs>
+            <a:gs pos="100000">
+              <a:schemeClr val="phClr">
+                <a:shade val="63000"/>
+                <a:satMod val="120000"/>
+              </a:schemeClr>
+            </a:gs>
+          </a:gsLst>
+          <a:lin ang="5400000" scaled="0"/>
+        </a:gradFill>
+      </a:bgFillStyleLst>
+    </a:fmtScheme>
+  </a:themeElements>
+  <a:objectDefaults>
+    <a:lnDef>
+      <a:spPr/>
+      <a:bodyPr/>
+      <a:lstStyle/>
+      <a:style>
+        <a:lnRef idx="2">
+          <a:schemeClr val="accent1"/>
+        </a:lnRef>
+        <a:fillRef idx="0">
+          <a:schemeClr val="accent1"/>
+        </a:fillRef>
+        <a:effectRef idx="1">
+          <a:schemeClr val="accent1"/>
+        </a:effectRef>
+        <a:fontRef idx="minor">
+          <a:schemeClr val="tx1"/>
+        </a:fontRef>
+      </a:style>
+    </a:lnDef>
+  </a:objectDefaults>
+  <a:extraClrSchemeLst/>
+  <a:extLst>
+    <a:ext uri="{05A4C25C-085E-4340-85A3-A5531E510DB2}">
+      <thm15:themeFamily xmlns:thm15="http://schemas.microsoft.com/office/thememl/2012/main" name="Office Theme" id="{2E142A2C-CD16-42D6-873A-C26D2A0506FA}" vid="{1BDDFF52-6CD6-40A5-AB3C-68EB2F1E4D0A}"/>
+    </a:ext>
+  </a:extLst>
+</a:theme>
 </file>
</xml_diff>